<commit_message>
david-mock-analysis: Review Test points with example questions inline
Each passage gets 3-5 key exam points (e.g. as의 쓰임 5가지) with a
teaching summary and 1-3 example questions plus answers, placed right
under the point in the analysis file. Separate Review Test files are
only produced with --review-files. Adds __underline__ markup.

Co-Authored-By: Claude Opus 5.5 <noreply@anthropic.com>
Claude-Session: https://claude.ai/code/session_017bUFn5iu6rT7uGg6evcDZP
</commit_message>
<xml_diff>
--- a/samples/26_9월모평_18번_지문분석.docx
+++ b/samples/26_9월모평_18번_지문분석.docx
@@ -7793,6 +7793,2506 @@
         <w:t xml:space="preserve"/>
       </w:r>
     </w:p>
+    <w:p>
+      <w:pPr>
+        <w:keepNext/>
+        <w:pBdr>
+          <w:bottom w:val="single" w:color="B5B5B5" w:sz="6" w:space="4"/>
+        </w:pBdr>
+        <w:spacing w:after="100" w:before="240" w:line="300"/>
+      </w:pPr>
+      <w:r>
+        <w:rPr>
+          <w:rFonts w:ascii="Malgun Gothic" w:cs="Malgun Gothic" w:eastAsia="Malgun Gothic" w:hAnsi="Malgun Gothic"/>
+          <w:b/>
+          <w:bCs/>
+          <w:color w:val="FFFFFF"/>
+          <w:sz w:val="16"/>
+          <w:szCs w:val="16"/>
+          <w:shd w:fill="111111" w:color="auto" w:val="clear"/>
+        </w:rPr>
+        <w:t xml:space="preserve"> REVIEW </w:t>
+      </w:r>
+      <w:r>
+        <w:rPr>
+          <w:rFonts w:ascii="Malgun Gothic" w:cs="Malgun Gothic" w:eastAsia="Malgun Gothic" w:hAnsi="Malgun Gothic"/>
+          <w:b/>
+          <w:bCs/>
+          <w:color w:val="111111"/>
+          <w:sz w:val="23"/>
+          <w:szCs w:val="23"/>
+        </w:rPr>
+        <w:t xml:space="preserve">  Review Test 포인트 — 시험에 낼 핵심</w:t>
+      </w:r>
+    </w:p>
+    <w:p>
+      <w:pPr>
+        <w:keepNext/>
+        <w:spacing w:after="60" w:before="240" w:line="300"/>
+      </w:pPr>
+      <w:r>
+        <w:rPr>
+          <w:rFonts w:ascii="Malgun Gothic" w:cs="Malgun Gothic" w:eastAsia="Malgun Gothic" w:hAnsi="Malgun Gothic"/>
+          <w:b/>
+          <w:bCs/>
+          <w:color w:val="FFFFFF"/>
+          <w:sz w:val="17"/>
+          <w:szCs w:val="17"/>
+          <w:shd w:fill="B3261E" w:color="auto" w:val="clear"/>
+        </w:rPr>
+        <w:t xml:space="preserve"> POINT 1 </w:t>
+      </w:r>
+      <w:r>
+        <w:rPr>
+          <w:rFonts w:ascii="Malgun Gothic" w:cs="Malgun Gothic" w:eastAsia="Malgun Gothic" w:hAnsi="Malgun Gothic"/>
+          <w:b/>
+          <w:bCs/>
+          <w:color w:val="111111"/>
+          <w:sz w:val="22"/>
+          <w:szCs w:val="22"/>
+        </w:rPr>
+        <w:t xml:space="preserve">  as의 쓰임 5가지</w:t>
+      </w:r>
+      <w:r>
+        <w:rPr>
+          <w:rFonts w:ascii="Malgun Gothic" w:cs="Malgun Gothic" w:eastAsia="Malgun Gothic" w:hAnsi="Malgun Gothic"/>
+          <w:color w:val="6B6B6B"/>
+          <w:sz w:val="16"/>
+          <w:szCs w:val="16"/>
+        </w:rPr>
+        <w:t xml:space="preserve">   [2번 문장]</w:t>
+      </w:r>
+    </w:p>
+    <w:p>
+      <w:pPr>
+        <w:keepNext/>
+        <w:spacing w:after="60" w:before="0" w:line="300"/>
+      </w:pPr>
+      <w:r>
+        <w:rPr>
+          <w:rFonts w:ascii="Malgun Gothic" w:cs="Malgun Gothic" w:eastAsia="Malgun Gothic" w:hAnsi="Malgun Gothic"/>
+          <w:color w:val="6B6B6B"/>
+          <w:sz w:val="17"/>
+          <w:szCs w:val="17"/>
+        </w:rPr>
+        <w:t xml:space="preserve">왜 중요? 문장 첫머리 As는 전치사(~로서)인지 접속사인지 구별하는 문제로 단골 출제된다.</w:t>
+      </w:r>
+    </w:p>
+    <w:tbl>
+      <w:tblPr>
+        <w:tblW w:type="dxa" w:w="9866"/>
+        <w:tblBorders>
+          <w:top w:val="single" w:color="auto" w:sz="4"/>
+          <w:left w:val="single" w:color="auto" w:sz="4"/>
+          <w:bottom w:val="single" w:color="auto" w:sz="4"/>
+          <w:right w:val="single" w:color="auto" w:sz="4"/>
+          <w:insideH w:val="single" w:color="auto" w:sz="4"/>
+          <w:insideV w:val="single" w:color="auto" w:sz="4"/>
+        </w:tblBorders>
+      </w:tblPr>
+      <w:tblGrid>
+        <w:gridCol w:w="9866"/>
+      </w:tblGrid>
+      <w:tr>
+        <w:tc>
+          <w:tcPr>
+            <w:tcW w:type="dxa" w:w="9866"/>
+            <w:tcBorders>
+              <w:top w:val="none" w:color="FFFFFF" w:sz="0"/>
+              <w:left w:val="single" w:color="111111" w:sz="24"/>
+              <w:bottom w:val="none" w:color="FFFFFF" w:sz="0"/>
+              <w:right w:val="none" w:color="FFFFFF" w:sz="0"/>
+            </w:tcBorders>
+            <w:shd w:fill="F3F3F3" w:color="auto" w:val="clear"/>
+            <w:tcMar>
+              <w:top w:type="dxa" w:w="60"/>
+              <w:left w:type="dxa" w:w="100"/>
+              <w:bottom w:type="dxa" w:w="60"/>
+              <w:right w:type="dxa" w:w="100"/>
+            </w:tcMar>
+            <w:vAlign w:val="top"/>
+          </w:tcPr>
+          <w:p>
+            <w:pPr>
+              <w:spacing w:after="60" w:before="0" w:line="300"/>
+            </w:pPr>
+            <w:r>
+              <w:rPr>
+                <w:rFonts w:ascii="Malgun Gothic" w:cs="Malgun Gothic" w:eastAsia="Malgun Gothic" w:hAnsi="Malgun Gothic"/>
+                <w:b/>
+                <w:bCs/>
+                <w:color w:val="111111"/>
+                <w:sz w:val="19"/>
+                <w:szCs w:val="19"/>
+              </w:rPr>
+              <w:t xml:space="preserve">정리</w:t>
+            </w:r>
+          </w:p>
+          <w:p>
+            <w:pPr>
+              <w:spacing w:after="40" w:before="0" w:line="300"/>
+            </w:pPr>
+            <w:r>
+              <w:rPr>
+                <w:rFonts w:ascii="Malgun Gothic" w:cs="Malgun Gothic" w:eastAsia="Malgun Gothic" w:hAnsi="Malgun Gothic"/>
+                <w:color w:val="111111"/>
+                <w:sz w:val="18"/>
+                <w:szCs w:val="18"/>
+              </w:rPr>
+              <w:t xml:space="preserve">① 전치사 ~로서(자격) + 명사: </w:t>
+            </w:r>
+            <w:r>
+              <w:rPr>
+                <w:rFonts w:ascii="Malgun Gothic" w:cs="Malgun Gothic" w:eastAsia="Malgun Gothic" w:hAnsi="Malgun Gothic"/>
+                <w:b/>
+                <w:bCs/>
+                <w:color w:val="111111"/>
+                <w:sz w:val="18"/>
+                <w:szCs w:val="18"/>
+              </w:rPr>
+              <w:t xml:space="preserve">As a former student</w:t>
+            </w:r>
+            <w:r>
+              <w:rPr>
+                <w:rFonts w:ascii="Malgun Gothic" w:cs="Malgun Gothic" w:eastAsia="Malgun Gothic" w:hAnsi="Malgun Gothic"/>
+                <w:color w:val="111111"/>
+                <w:sz w:val="18"/>
+                <w:szCs w:val="18"/>
+              </w:rPr>
+              <w:t xml:space="preserve">, I am proud ... (본문)</w:t>
+            </w:r>
+          </w:p>
+          <w:p>
+            <w:pPr>
+              <w:spacing w:after="40" w:before="0" w:line="300"/>
+            </w:pPr>
+            <w:r>
+              <w:rPr>
+                <w:rFonts w:ascii="Malgun Gothic" w:cs="Malgun Gothic" w:eastAsia="Malgun Gothic" w:hAnsi="Malgun Gothic"/>
+                <w:color w:val="111111"/>
+                <w:sz w:val="18"/>
+                <w:szCs w:val="18"/>
+              </w:rPr>
+              <w:t xml:space="preserve">② 접속사 ~할 때(시간): As she walked into the classroom, she heard a voice.</w:t>
+            </w:r>
+          </w:p>
+          <w:p>
+            <w:pPr>
+              <w:spacing w:after="40" w:before="0" w:line="300"/>
+            </w:pPr>
+            <w:r>
+              <w:rPr>
+                <w:rFonts w:ascii="Malgun Gothic" w:cs="Malgun Gothic" w:eastAsia="Malgun Gothic" w:hAnsi="Malgun Gothic"/>
+                <w:color w:val="111111"/>
+                <w:sz w:val="18"/>
+                <w:szCs w:val="18"/>
+              </w:rPr>
+              <w:t xml:space="preserve">③ 접속사 ~ 때문에(이유): As it was raining, we stayed indoors.</w:t>
+            </w:r>
+          </w:p>
+          <w:p>
+            <w:pPr>
+              <w:spacing w:after="40" w:before="0" w:line="300"/>
+            </w:pPr>
+            <w:r>
+              <w:rPr>
+                <w:rFonts w:ascii="Malgun Gothic" w:cs="Malgun Gothic" w:eastAsia="Malgun Gothic" w:hAnsi="Malgun Gothic"/>
+                <w:color w:val="111111"/>
+                <w:sz w:val="18"/>
+                <w:szCs w:val="18"/>
+              </w:rPr>
+              <w:t xml:space="preserve">④ 접속사 ~하는 대로(방식): Do as your teacher tells you.</w:t>
+            </w:r>
+          </w:p>
+          <w:p>
+            <w:pPr>
+              <w:spacing w:after="40" w:before="0" w:line="300"/>
+            </w:pPr>
+            <w:r>
+              <w:rPr>
+                <w:rFonts w:ascii="Malgun Gothic" w:cs="Malgun Gothic" w:eastAsia="Malgun Gothic" w:hAnsi="Malgun Gothic"/>
+                <w:color w:val="111111"/>
+                <w:sz w:val="18"/>
+                <w:szCs w:val="18"/>
+              </w:rPr>
+              <w:t xml:space="preserve">⑤ 접속사 ~함에 따라(비례): As time went by, he grew more confident.</w:t>
+            </w:r>
+          </w:p>
+          <w:p>
+            <w:pPr>
+              <w:spacing w:after="40" w:before="0" w:line="300"/>
+            </w:pPr>
+            <w:r>
+              <w:rPr>
+                <w:rFonts w:ascii="Malgun Gothic" w:cs="Malgun Gothic" w:eastAsia="Malgun Gothic" w:hAnsi="Malgun Gothic"/>
+                <w:color w:val="111111"/>
+                <w:sz w:val="18"/>
+                <w:szCs w:val="18"/>
+              </w:rPr>
+              <w:t xml:space="preserve">구별법: as 뒤에 </w:t>
+            </w:r>
+            <w:r>
+              <w:rPr>
+                <w:rFonts w:ascii="Malgun Gothic" w:cs="Malgun Gothic" w:eastAsia="Malgun Gothic" w:hAnsi="Malgun Gothic"/>
+                <w:b/>
+                <w:bCs/>
+                <w:color w:val="111111"/>
+                <w:sz w:val="18"/>
+                <w:szCs w:val="18"/>
+              </w:rPr>
+              <w:t xml:space="preserve">명사(구)만</w:t>
+            </w:r>
+            <w:r>
+              <w:rPr>
+                <w:rFonts w:ascii="Malgun Gothic" w:cs="Malgun Gothic" w:eastAsia="Malgun Gothic" w:hAnsi="Malgun Gothic"/>
+                <w:color w:val="111111"/>
+                <w:sz w:val="18"/>
+                <w:szCs w:val="18"/>
+              </w:rPr>
+              <w:t xml:space="preserve"> → 전치사 / </w:t>
+            </w:r>
+            <w:r>
+              <w:rPr>
+                <w:rFonts w:ascii="Malgun Gothic" w:cs="Malgun Gothic" w:eastAsia="Malgun Gothic" w:hAnsi="Malgun Gothic"/>
+                <w:b/>
+                <w:bCs/>
+                <w:color w:val="111111"/>
+                <w:sz w:val="18"/>
+                <w:szCs w:val="18"/>
+              </w:rPr>
+              <w:t xml:space="preserve">S+V</w:t>
+            </w:r>
+            <w:r>
+              <w:rPr>
+                <w:rFonts w:ascii="Malgun Gothic" w:cs="Malgun Gothic" w:eastAsia="Malgun Gothic" w:hAnsi="Malgun Gothic"/>
+                <w:color w:val="111111"/>
+                <w:sz w:val="18"/>
+                <w:szCs w:val="18"/>
+              </w:rPr>
+              <w:t xml:space="preserve"> → 접속사(문맥으로 때·이유·방식·비례 판단)</w:t>
+            </w:r>
+          </w:p>
+        </w:tc>
+      </w:tr>
+    </w:tbl>
+    <w:p>
+      <w:pPr>
+        <w:spacing w:after="60" w:before="0" w:line="300"/>
+      </w:pPr>
+      <w:r>
+        <w:rPr>
+          <w:rFonts w:ascii="Malgun Gothic" w:cs="Malgun Gothic" w:eastAsia="Malgun Gothic" w:hAnsi="Malgun Gothic"/>
+          <w:color w:val="111111"/>
+          <w:sz w:val="20"/>
+          <w:szCs w:val="20"/>
+        </w:rPr>
+        <w:t xml:space="preserve"/>
+      </w:r>
+    </w:p>
+    <w:p>
+      <w:pPr>
+        <w:keepNext/>
+        <w:spacing w:after="0" w:before="60" w:line="300"/>
+      </w:pPr>
+      <w:r>
+        <w:rPr>
+          <w:rFonts w:ascii="Malgun Gothic" w:cs="Malgun Gothic" w:eastAsia="Malgun Gothic" w:hAnsi="Malgun Gothic"/>
+          <w:b/>
+          <w:bCs/>
+          <w:color w:val="111111"/>
+          <w:sz w:val="19"/>
+          <w:szCs w:val="19"/>
+        </w:rPr>
+        <w:t xml:space="preserve">▶ 이렇게 내면 된다</w:t>
+      </w:r>
+    </w:p>
+    <w:p>
+      <w:pPr>
+        <w:keepNext/>
+        <w:spacing w:after="80" w:before="200" w:line="300"/>
+      </w:pPr>
+      <w:r>
+        <w:rPr>
+          <w:rFonts w:ascii="Malgun Gothic" w:cs="Malgun Gothic" w:eastAsia="Malgun Gothic" w:hAnsi="Malgun Gothic"/>
+          <w:b/>
+          <w:bCs/>
+          <w:color w:val="111111"/>
+          <w:sz w:val="21"/>
+          <w:szCs w:val="21"/>
+        </w:rPr>
+        <w:t xml:space="preserve">1. </w:t>
+      </w:r>
+      <w:r>
+        <w:rPr>
+          <w:rFonts w:ascii="Malgun Gothic" w:cs="Malgun Gothic" w:eastAsia="Malgun Gothic" w:hAnsi="Malgun Gothic"/>
+          <w:b/>
+          <w:bCs/>
+          <w:color w:val="111111"/>
+          <w:sz w:val="20"/>
+          <w:szCs w:val="20"/>
+        </w:rPr>
+        <w:t xml:space="preserve">다음 문장의 밑줄 친 </w:t>
+      </w:r>
+      <w:r>
+        <w:rPr>
+          <w:rFonts w:ascii="Malgun Gothic" w:cs="Malgun Gothic" w:eastAsia="Malgun Gothic" w:hAnsi="Malgun Gothic"/>
+          <w:b/>
+          <w:bCs/>
+          <w:color w:val="111111"/>
+          <w:sz w:val="20"/>
+          <w:szCs w:val="20"/>
+          <w:u w:val="single"/>
+        </w:rPr>
+        <w:t xml:space="preserve">as</w:t>
+      </w:r>
+      <w:r>
+        <w:rPr>
+          <w:rFonts w:ascii="Malgun Gothic" w:cs="Malgun Gothic" w:eastAsia="Malgun Gothic" w:hAnsi="Malgun Gothic"/>
+          <w:b/>
+          <w:bCs/>
+          <w:color w:val="111111"/>
+          <w:sz w:val="20"/>
+          <w:szCs w:val="20"/>
+        </w:rPr>
+        <w:t xml:space="preserve">와 쓰임이 같은 것은?</w:t>
+      </w:r>
+      <w:r>
+        <w:rPr>
+          <w:rFonts w:ascii="Malgun Gothic" w:cs="Malgun Gothic" w:eastAsia="Malgun Gothic" w:hAnsi="Malgun Gothic"/>
+          <w:color w:val="6B6B6B"/>
+          <w:sz w:val="15"/>
+          <w:szCs w:val="15"/>
+        </w:rPr>
+        <w:t xml:space="preserve">  [쓰임 구별]</w:t>
+      </w:r>
+    </w:p>
+    <w:tbl>
+      <w:tblPr>
+        <w:tblW w:type="dxa" w:w="9866"/>
+        <w:tblBorders>
+          <w:top w:val="single" w:color="auto" w:sz="4"/>
+          <w:left w:val="single" w:color="auto" w:sz="4"/>
+          <w:bottom w:val="single" w:color="auto" w:sz="4"/>
+          <w:right w:val="single" w:color="auto" w:sz="4"/>
+          <w:insideH w:val="single" w:color="auto" w:sz="4"/>
+          <w:insideV w:val="single" w:color="auto" w:sz="4"/>
+        </w:tblBorders>
+      </w:tblPr>
+      <w:tblGrid>
+        <w:gridCol w:w="9866"/>
+      </w:tblGrid>
+      <w:tr>
+        <w:tc>
+          <w:tcPr>
+            <w:tcW w:type="dxa" w:w="9866"/>
+            <w:tcBorders>
+              <w:top w:val="none" w:color="FFFFFF" w:sz="0"/>
+              <w:left w:val="single" w:color="B5B5B5" w:sz="24"/>
+              <w:bottom w:val="none" w:color="FFFFFF" w:sz="0"/>
+              <w:right w:val="none" w:color="FFFFFF" w:sz="0"/>
+            </w:tcBorders>
+            <w:shd w:fill="FFFFFF" w:color="auto" w:val="clear"/>
+            <w:tcMar>
+              <w:top w:type="dxa" w:w="60"/>
+              <w:left w:type="dxa" w:w="100"/>
+              <w:bottom w:type="dxa" w:w="60"/>
+              <w:right w:type="dxa" w:w="100"/>
+            </w:tcMar>
+            <w:vAlign w:val="top"/>
+          </w:tcPr>
+          <w:p>
+            <w:pPr>
+              <w:spacing w:after="40" w:before="0" w:line="340"/>
+            </w:pPr>
+            <w:r>
+              <w:rPr>
+                <w:rFonts w:ascii="Malgun Gothic" w:cs="Malgun Gothic" w:eastAsia="Malgun Gothic" w:hAnsi="Malgun Gothic"/>
+                <w:color w:val="111111"/>
+                <w:sz w:val="19"/>
+                <w:szCs w:val="19"/>
+                <w:u w:val="single"/>
+              </w:rPr>
+              <w:t xml:space="preserve">As</w:t>
+            </w:r>
+            <w:r>
+              <w:rPr>
+                <w:rFonts w:ascii="Malgun Gothic" w:cs="Malgun Gothic" w:eastAsia="Malgun Gothic" w:hAnsi="Malgun Gothic"/>
+                <w:color w:val="111111"/>
+                <w:sz w:val="19"/>
+                <w:szCs w:val="19"/>
+              </w:rPr>
+              <w:t xml:space="preserve"> a former student, I am extremely proud that the school has become one of the best schools in the local community.</w:t>
+            </w:r>
+          </w:p>
+        </w:tc>
+      </w:tr>
+    </w:tbl>
+    <w:p>
+      <w:pPr>
+        <w:spacing w:after="60" w:before="0" w:line="300"/>
+      </w:pPr>
+      <w:r>
+        <w:rPr>
+          <w:rFonts w:ascii="Malgun Gothic" w:cs="Malgun Gothic" w:eastAsia="Malgun Gothic" w:hAnsi="Malgun Gothic"/>
+          <w:color w:val="111111"/>
+          <w:sz w:val="20"/>
+          <w:szCs w:val="20"/>
+        </w:rPr>
+        <w:t xml:space="preserve"/>
+      </w:r>
+    </w:p>
+    <w:p>
+      <w:pPr>
+        <w:spacing w:after="30" w:before="0" w:line="300"/>
+        <w:ind w:left="200"/>
+      </w:pPr>
+      <w:r>
+        <w:rPr>
+          <w:rFonts w:ascii="Malgun Gothic" w:cs="Malgun Gothic" w:eastAsia="Malgun Gothic" w:hAnsi="Malgun Gothic"/>
+          <w:color w:val="111111"/>
+          <w:sz w:val="19"/>
+          <w:szCs w:val="19"/>
+        </w:rPr>
+        <w:t xml:space="preserve">① </w:t>
+      </w:r>
+      <w:r>
+        <w:rPr>
+          <w:rFonts w:ascii="Malgun Gothic" w:cs="Malgun Gothic" w:eastAsia="Malgun Gothic" w:hAnsi="Malgun Gothic"/>
+          <w:color w:val="111111"/>
+          <w:sz w:val="19"/>
+          <w:szCs w:val="19"/>
+          <w:u w:val="single"/>
+        </w:rPr>
+        <w:t xml:space="preserve">As</w:t>
+      </w:r>
+      <w:r>
+        <w:rPr>
+          <w:rFonts w:ascii="Malgun Gothic" w:cs="Malgun Gothic" w:eastAsia="Malgun Gothic" w:hAnsi="Malgun Gothic"/>
+          <w:color w:val="111111"/>
+          <w:sz w:val="19"/>
+          <w:szCs w:val="19"/>
+        </w:rPr>
+        <w:t xml:space="preserve"> it was raining, we stayed indoors.</w:t>
+      </w:r>
+    </w:p>
+    <w:p>
+      <w:pPr>
+        <w:spacing w:after="30" w:before="0" w:line="300"/>
+        <w:ind w:left="200"/>
+      </w:pPr>
+      <w:r>
+        <w:rPr>
+          <w:rFonts w:ascii="Malgun Gothic" w:cs="Malgun Gothic" w:eastAsia="Malgun Gothic" w:hAnsi="Malgun Gothic"/>
+          <w:color w:val="111111"/>
+          <w:sz w:val="19"/>
+          <w:szCs w:val="19"/>
+        </w:rPr>
+        <w:t xml:space="preserve">② She was respected </w:t>
+      </w:r>
+      <w:r>
+        <w:rPr>
+          <w:rFonts w:ascii="Malgun Gothic" w:cs="Malgun Gothic" w:eastAsia="Malgun Gothic" w:hAnsi="Malgun Gothic"/>
+          <w:color w:val="111111"/>
+          <w:sz w:val="19"/>
+          <w:szCs w:val="19"/>
+          <w:u w:val="single"/>
+        </w:rPr>
+        <w:t xml:space="preserve">as</w:t>
+      </w:r>
+      <w:r>
+        <w:rPr>
+          <w:rFonts w:ascii="Malgun Gothic" w:cs="Malgun Gothic" w:eastAsia="Malgun Gothic" w:hAnsi="Malgun Gothic"/>
+          <w:color w:val="111111"/>
+          <w:sz w:val="19"/>
+          <w:szCs w:val="19"/>
+        </w:rPr>
+        <w:t xml:space="preserve"> a leader of the team.</w:t>
+      </w:r>
+    </w:p>
+    <w:p>
+      <w:pPr>
+        <w:spacing w:after="30" w:before="0" w:line="300"/>
+        <w:ind w:left="200"/>
+      </w:pPr>
+      <w:r>
+        <w:rPr>
+          <w:rFonts w:ascii="Malgun Gothic" w:cs="Malgun Gothic" w:eastAsia="Malgun Gothic" w:hAnsi="Malgun Gothic"/>
+          <w:color w:val="111111"/>
+          <w:sz w:val="19"/>
+          <w:szCs w:val="19"/>
+        </w:rPr>
+        <w:t xml:space="preserve">③ </w:t>
+      </w:r>
+      <w:r>
+        <w:rPr>
+          <w:rFonts w:ascii="Malgun Gothic" w:cs="Malgun Gothic" w:eastAsia="Malgun Gothic" w:hAnsi="Malgun Gothic"/>
+          <w:color w:val="111111"/>
+          <w:sz w:val="19"/>
+          <w:szCs w:val="19"/>
+          <w:u w:val="single"/>
+        </w:rPr>
+        <w:t xml:space="preserve">As</w:t>
+      </w:r>
+      <w:r>
+        <w:rPr>
+          <w:rFonts w:ascii="Malgun Gothic" w:cs="Malgun Gothic" w:eastAsia="Malgun Gothic" w:hAnsi="Malgun Gothic"/>
+          <w:color w:val="111111"/>
+          <w:sz w:val="19"/>
+          <w:szCs w:val="19"/>
+        </w:rPr>
+        <w:t xml:space="preserve"> he walked into the room, everyone stood up.</w:t>
+      </w:r>
+    </w:p>
+    <w:p>
+      <w:pPr>
+        <w:spacing w:after="30" w:before="0" w:line="300"/>
+        <w:ind w:left="200"/>
+      </w:pPr>
+      <w:r>
+        <w:rPr>
+          <w:rFonts w:ascii="Malgun Gothic" w:cs="Malgun Gothic" w:eastAsia="Malgun Gothic" w:hAnsi="Malgun Gothic"/>
+          <w:color w:val="111111"/>
+          <w:sz w:val="19"/>
+          <w:szCs w:val="19"/>
+        </w:rPr>
+        <w:t xml:space="preserve">④ Do </w:t>
+      </w:r>
+      <w:r>
+        <w:rPr>
+          <w:rFonts w:ascii="Malgun Gothic" w:cs="Malgun Gothic" w:eastAsia="Malgun Gothic" w:hAnsi="Malgun Gothic"/>
+          <w:color w:val="111111"/>
+          <w:sz w:val="19"/>
+          <w:szCs w:val="19"/>
+          <w:u w:val="single"/>
+        </w:rPr>
+        <w:t xml:space="preserve">as</w:t>
+      </w:r>
+      <w:r>
+        <w:rPr>
+          <w:rFonts w:ascii="Malgun Gothic" w:cs="Malgun Gothic" w:eastAsia="Malgun Gothic" w:hAnsi="Malgun Gothic"/>
+          <w:color w:val="111111"/>
+          <w:sz w:val="19"/>
+          <w:szCs w:val="19"/>
+        </w:rPr>
+        <w:t xml:space="preserve"> your teacher tells you.</w:t>
+      </w:r>
+    </w:p>
+    <w:p>
+      <w:pPr>
+        <w:spacing w:after="30" w:before="0" w:line="300"/>
+        <w:ind w:left="200"/>
+      </w:pPr>
+      <w:r>
+        <w:rPr>
+          <w:rFonts w:ascii="Malgun Gothic" w:cs="Malgun Gothic" w:eastAsia="Malgun Gothic" w:hAnsi="Malgun Gothic"/>
+          <w:color w:val="111111"/>
+          <w:sz w:val="19"/>
+          <w:szCs w:val="19"/>
+        </w:rPr>
+        <w:t xml:space="preserve">⑤ </w:t>
+      </w:r>
+      <w:r>
+        <w:rPr>
+          <w:rFonts w:ascii="Malgun Gothic" w:cs="Malgun Gothic" w:eastAsia="Malgun Gothic" w:hAnsi="Malgun Gothic"/>
+          <w:color w:val="111111"/>
+          <w:sz w:val="19"/>
+          <w:szCs w:val="19"/>
+          <w:u w:val="single"/>
+        </w:rPr>
+        <w:t xml:space="preserve">As</w:t>
+      </w:r>
+      <w:r>
+        <w:rPr>
+          <w:rFonts w:ascii="Malgun Gothic" w:cs="Malgun Gothic" w:eastAsia="Malgun Gothic" w:hAnsi="Malgun Gothic"/>
+          <w:color w:val="111111"/>
+          <w:sz w:val="19"/>
+          <w:szCs w:val="19"/>
+        </w:rPr>
+        <w:t xml:space="preserve"> time went by, he grew more confident.</w:t>
+      </w:r>
+    </w:p>
+    <w:p>
+      <w:pPr>
+        <w:spacing w:after="40" w:before="60" w:line="300"/>
+      </w:pPr>
+      <w:r>
+        <w:rPr>
+          <w:rFonts w:ascii="Malgun Gothic" w:cs="Malgun Gothic" w:eastAsia="Malgun Gothic" w:hAnsi="Malgun Gothic"/>
+          <w:color w:val="111111"/>
+          <w:sz w:val="19"/>
+          <w:szCs w:val="19"/>
+        </w:rPr>
+        <w:t xml:space="preserve">정답  </w:t>
+      </w:r>
+      <w:r>
+        <w:rPr>
+          <w:rFonts w:ascii="Malgun Gothic" w:cs="Malgun Gothic" w:eastAsia="Malgun Gothic" w:hAnsi="Malgun Gothic"/>
+          <w:b/>
+          <w:bCs/>
+          <w:color w:val="B3261E"/>
+          <w:sz w:val="19"/>
+          <w:szCs w:val="19"/>
+        </w:rPr>
+        <w:t xml:space="preserve">② She was respected as a leader of the team.</w:t>
+      </w:r>
+    </w:p>
+    <w:tbl>
+      <w:tblPr>
+        <w:tblW w:type="dxa" w:w="9866"/>
+        <w:tblBorders>
+          <w:top w:val="single" w:color="auto" w:sz="4"/>
+          <w:left w:val="single" w:color="auto" w:sz="4"/>
+          <w:bottom w:val="single" w:color="auto" w:sz="4"/>
+          <w:right w:val="single" w:color="auto" w:sz="4"/>
+          <w:insideH w:val="single" w:color="auto" w:sz="4"/>
+          <w:insideV w:val="single" w:color="auto" w:sz="4"/>
+        </w:tblBorders>
+      </w:tblPr>
+      <w:tblGrid>
+        <w:gridCol w:w="9866"/>
+      </w:tblGrid>
+      <w:tr>
+        <w:tc>
+          <w:tcPr>
+            <w:tcW w:type="dxa" w:w="9866"/>
+            <w:tcBorders>
+              <w:top w:val="none" w:color="FFFFFF" w:sz="0"/>
+              <w:left w:val="single" w:color="111111" w:sz="24"/>
+              <w:bottom w:val="none" w:color="FFFFFF" w:sz="0"/>
+              <w:right w:val="none" w:color="FFFFFF" w:sz="0"/>
+            </w:tcBorders>
+            <w:shd w:fill="F3F3F3" w:color="auto" w:val="clear"/>
+            <w:tcMar>
+              <w:top w:type="dxa" w:w="60"/>
+              <w:left w:type="dxa" w:w="100"/>
+              <w:bottom w:type="dxa" w:w="60"/>
+              <w:right w:type="dxa" w:w="100"/>
+            </w:tcMar>
+            <w:vAlign w:val="top"/>
+          </w:tcPr>
+          <w:p>
+            <w:pPr>
+              <w:spacing w:after="30" w:before="0" w:line="300"/>
+            </w:pPr>
+            <w:r>
+              <w:rPr>
+                <w:rFonts w:ascii="Malgun Gothic" w:cs="Malgun Gothic" w:eastAsia="Malgun Gothic" w:hAnsi="Malgun Gothic"/>
+                <w:color w:val="111111"/>
+                <w:sz w:val="17"/>
+                <w:szCs w:val="17"/>
+              </w:rPr>
+              <w:t xml:space="preserve">본문 as는 명사 a former student 앞의 전치사(~로서). ②도 a leader 앞 전치사. ① 이유 ③ 시간 ④ 방식 ⑤ 비례 접속사.</w:t>
+            </w:r>
+          </w:p>
+        </w:tc>
+      </w:tr>
+    </w:tbl>
+    <w:p>
+      <w:pPr>
+        <w:keepNext/>
+        <w:spacing w:after="60" w:before="240" w:line="300"/>
+      </w:pPr>
+      <w:r>
+        <w:rPr>
+          <w:rFonts w:ascii="Malgun Gothic" w:cs="Malgun Gothic" w:eastAsia="Malgun Gothic" w:hAnsi="Malgun Gothic"/>
+          <w:b/>
+          <w:bCs/>
+          <w:color w:val="FFFFFF"/>
+          <w:sz w:val="17"/>
+          <w:szCs w:val="17"/>
+          <w:shd w:fill="B3261E" w:color="auto" w:val="clear"/>
+        </w:rPr>
+        <w:t xml:space="preserve"> POINT 2 </w:t>
+      </w:r>
+      <w:r>
+        <w:rPr>
+          <w:rFonts w:ascii="Malgun Gothic" w:cs="Malgun Gothic" w:eastAsia="Malgun Gothic" w:hAnsi="Malgun Gothic"/>
+          <w:b/>
+          <w:bCs/>
+          <w:color w:val="111111"/>
+          <w:sz w:val="22"/>
+          <w:szCs w:val="22"/>
+        </w:rPr>
+        <w:t xml:space="preserve">  have + O + p.p. (목적격보어 형태)</w:t>
+      </w:r>
+      <w:r>
+        <w:rPr>
+          <w:rFonts w:ascii="Malgun Gothic" w:cs="Malgun Gothic" w:eastAsia="Malgun Gothic" w:hAnsi="Malgun Gothic"/>
+          <w:color w:val="6B6B6B"/>
+          <w:sz w:val="16"/>
+          <w:szCs w:val="16"/>
+        </w:rPr>
+        <w:t xml:space="preserve">   [4번 문장]</w:t>
+      </w:r>
+    </w:p>
+    <w:p>
+      <w:pPr>
+        <w:keepNext/>
+        <w:spacing w:after="60" w:before="0" w:line="300"/>
+      </w:pPr>
+      <w:r>
+        <w:rPr>
+          <w:rFonts w:ascii="Malgun Gothic" w:cs="Malgun Gothic" w:eastAsia="Malgun Gothic" w:hAnsi="Malgun Gothic"/>
+          <w:color w:val="6B6B6B"/>
+          <w:sz w:val="17"/>
+          <w:szCs w:val="17"/>
+        </w:rPr>
+        <w:t xml:space="preserve">왜 중요? scheduled ↔ scheduling은 서술형 어법 고치기로 내기 가장 좋은 자리다.</w:t>
+      </w:r>
+    </w:p>
+    <w:tbl>
+      <w:tblPr>
+        <w:tblW w:type="dxa" w:w="9866"/>
+        <w:tblBorders>
+          <w:top w:val="single" w:color="auto" w:sz="4"/>
+          <w:left w:val="single" w:color="auto" w:sz="4"/>
+          <w:bottom w:val="single" w:color="auto" w:sz="4"/>
+          <w:right w:val="single" w:color="auto" w:sz="4"/>
+          <w:insideH w:val="single" w:color="auto" w:sz="4"/>
+          <w:insideV w:val="single" w:color="auto" w:sz="4"/>
+        </w:tblBorders>
+      </w:tblPr>
+      <w:tblGrid>
+        <w:gridCol w:w="9866"/>
+      </w:tblGrid>
+      <w:tr>
+        <w:tc>
+          <w:tcPr>
+            <w:tcW w:type="dxa" w:w="9866"/>
+            <w:tcBorders>
+              <w:top w:val="none" w:color="FFFFFF" w:sz="0"/>
+              <w:left w:val="single" w:color="111111" w:sz="24"/>
+              <w:bottom w:val="none" w:color="FFFFFF" w:sz="0"/>
+              <w:right w:val="none" w:color="FFFFFF" w:sz="0"/>
+            </w:tcBorders>
+            <w:shd w:fill="F3F3F3" w:color="auto" w:val="clear"/>
+            <w:tcMar>
+              <w:top w:type="dxa" w:w="60"/>
+              <w:left w:type="dxa" w:w="100"/>
+              <w:bottom w:type="dxa" w:w="60"/>
+              <w:right w:type="dxa" w:w="100"/>
+            </w:tcMar>
+            <w:vAlign w:val="top"/>
+          </w:tcPr>
+          <w:p>
+            <w:pPr>
+              <w:spacing w:after="60" w:before="0" w:line="300"/>
+            </w:pPr>
+            <w:r>
+              <w:rPr>
+                <w:rFonts w:ascii="Malgun Gothic" w:cs="Malgun Gothic" w:eastAsia="Malgun Gothic" w:hAnsi="Malgun Gothic"/>
+                <w:b/>
+                <w:bCs/>
+                <w:color w:val="111111"/>
+                <w:sz w:val="19"/>
+                <w:szCs w:val="19"/>
+              </w:rPr>
+              <w:t xml:space="preserve">정리</w:t>
+            </w:r>
+          </w:p>
+          <w:p>
+            <w:pPr>
+              <w:spacing w:after="40" w:before="0" w:line="300"/>
+            </w:pPr>
+            <w:r>
+              <w:rPr>
+                <w:rFonts w:ascii="Malgun Gothic" w:cs="Malgun Gothic" w:eastAsia="Malgun Gothic" w:hAnsi="Malgun Gothic"/>
+                <w:color w:val="111111"/>
+                <w:sz w:val="18"/>
+                <w:szCs w:val="18"/>
+              </w:rPr>
+              <w:t xml:space="preserve">have + O + 동사원형: O가 ~하게 하다 (O가 행위자) — I had him fix my car.</w:t>
+            </w:r>
+          </w:p>
+          <w:p>
+            <w:pPr>
+              <w:spacing w:after="40" w:before="0" w:line="300"/>
+            </w:pPr>
+            <w:r>
+              <w:rPr>
+                <w:rFonts w:ascii="Malgun Gothic" w:cs="Malgun Gothic" w:eastAsia="Malgun Gothic" w:hAnsi="Malgun Gothic"/>
+                <w:color w:val="111111"/>
+                <w:sz w:val="18"/>
+                <w:szCs w:val="18"/>
+              </w:rPr>
+              <w:t xml:space="preserve">have + O + p.p.: O가 ~되게 하다 / ~된 상태로 있다 (O가 대상) — I have a trip </w:t>
+            </w:r>
+            <w:r>
+              <w:rPr>
+                <w:rFonts w:ascii="Malgun Gothic" w:cs="Malgun Gothic" w:eastAsia="Malgun Gothic" w:hAnsi="Malgun Gothic"/>
+                <w:b/>
+                <w:bCs/>
+                <w:color w:val="111111"/>
+                <w:sz w:val="18"/>
+                <w:szCs w:val="18"/>
+              </w:rPr>
+              <w:t xml:space="preserve">scheduled</w:t>
+            </w:r>
+            <w:r>
+              <w:rPr>
+                <w:rFonts w:ascii="Malgun Gothic" w:cs="Malgun Gothic" w:eastAsia="Malgun Gothic" w:hAnsi="Malgun Gothic"/>
+                <w:color w:val="111111"/>
+                <w:sz w:val="18"/>
+                <w:szCs w:val="18"/>
+              </w:rPr>
+              <w:t xml:space="preserve">. (본문)</w:t>
+            </w:r>
+          </w:p>
+          <w:p>
+            <w:pPr>
+              <w:spacing w:after="40" w:before="0" w:line="300"/>
+            </w:pPr>
+            <w:r>
+              <w:rPr>
+                <w:rFonts w:ascii="Malgun Gothic" w:cs="Malgun Gothic" w:eastAsia="Malgun Gothic" w:hAnsi="Malgun Gothic"/>
+                <w:color w:val="111111"/>
+                <w:sz w:val="18"/>
+                <w:szCs w:val="18"/>
+              </w:rPr>
+              <w:t xml:space="preserve">have + O + -ing: O가 계속 ~하게 두다 — He had us waiting for an hour.</w:t>
+            </w:r>
+          </w:p>
+          <w:p>
+            <w:pPr>
+              <w:spacing w:after="40" w:before="0" w:line="300"/>
+            </w:pPr>
+            <w:r>
+              <w:rPr>
+                <w:rFonts w:ascii="Malgun Gothic" w:cs="Malgun Gothic" w:eastAsia="Malgun Gothic" w:hAnsi="Malgun Gothic"/>
+                <w:color w:val="111111"/>
+                <w:sz w:val="18"/>
+                <w:szCs w:val="18"/>
+              </w:rPr>
+              <w:t xml:space="preserve">판단법: O와 보어 사이에 be동사를 넣어 본다 → a trip is scheduled (수동) → p.p.</w:t>
+            </w:r>
+          </w:p>
+        </w:tc>
+      </w:tr>
+    </w:tbl>
+    <w:p>
+      <w:pPr>
+        <w:spacing w:after="60" w:before="0" w:line="300"/>
+      </w:pPr>
+      <w:r>
+        <w:rPr>
+          <w:rFonts w:ascii="Malgun Gothic" w:cs="Malgun Gothic" w:eastAsia="Malgun Gothic" w:hAnsi="Malgun Gothic"/>
+          <w:color w:val="111111"/>
+          <w:sz w:val="20"/>
+          <w:szCs w:val="20"/>
+        </w:rPr>
+        <w:t xml:space="preserve"/>
+      </w:r>
+    </w:p>
+    <w:p>
+      <w:pPr>
+        <w:keepNext/>
+        <w:spacing w:after="0" w:before="60" w:line="300"/>
+      </w:pPr>
+      <w:r>
+        <w:rPr>
+          <w:rFonts w:ascii="Malgun Gothic" w:cs="Malgun Gothic" w:eastAsia="Malgun Gothic" w:hAnsi="Malgun Gothic"/>
+          <w:b/>
+          <w:bCs/>
+          <w:color w:val="111111"/>
+          <w:sz w:val="19"/>
+          <w:szCs w:val="19"/>
+        </w:rPr>
+        <w:t xml:space="preserve">▶ 이렇게 내면 된다</w:t>
+      </w:r>
+    </w:p>
+    <w:p>
+      <w:pPr>
+        <w:keepNext/>
+        <w:spacing w:after="80" w:before="200" w:line="300"/>
+      </w:pPr>
+      <w:r>
+        <w:rPr>
+          <w:rFonts w:ascii="Malgun Gothic" w:cs="Malgun Gothic" w:eastAsia="Malgun Gothic" w:hAnsi="Malgun Gothic"/>
+          <w:b/>
+          <w:bCs/>
+          <w:color w:val="111111"/>
+          <w:sz w:val="21"/>
+          <w:szCs w:val="21"/>
+        </w:rPr>
+        <w:t xml:space="preserve">1. </w:t>
+      </w:r>
+      <w:r>
+        <w:rPr>
+          <w:rFonts w:ascii="Malgun Gothic" w:cs="Malgun Gothic" w:eastAsia="Malgun Gothic" w:hAnsi="Malgun Gothic"/>
+          <w:b/>
+          <w:bCs/>
+          <w:color w:val="111111"/>
+          <w:sz w:val="20"/>
+          <w:szCs w:val="20"/>
+        </w:rPr>
+        <w:t xml:space="preserve">다음 문장에서 어법상 틀린 부분을 찾아 바르게 고치시오.</w:t>
+      </w:r>
+      <w:r>
+        <w:rPr>
+          <w:rFonts w:ascii="Malgun Gothic" w:cs="Malgun Gothic" w:eastAsia="Malgun Gothic" w:hAnsi="Malgun Gothic"/>
+          <w:color w:val="6B6B6B"/>
+          <w:sz w:val="15"/>
+          <w:szCs w:val="15"/>
+        </w:rPr>
+        <w:t xml:space="preserve">  [어법 고치기(서술형)]</w:t>
+      </w:r>
+    </w:p>
+    <w:tbl>
+      <w:tblPr>
+        <w:tblW w:type="dxa" w:w="9866"/>
+        <w:tblBorders>
+          <w:top w:val="single" w:color="auto" w:sz="4"/>
+          <w:left w:val="single" w:color="auto" w:sz="4"/>
+          <w:bottom w:val="single" w:color="auto" w:sz="4"/>
+          <w:right w:val="single" w:color="auto" w:sz="4"/>
+          <w:insideH w:val="single" w:color="auto" w:sz="4"/>
+          <w:insideV w:val="single" w:color="auto" w:sz="4"/>
+        </w:tblBorders>
+      </w:tblPr>
+      <w:tblGrid>
+        <w:gridCol w:w="9866"/>
+      </w:tblGrid>
+      <w:tr>
+        <w:tc>
+          <w:tcPr>
+            <w:tcW w:type="dxa" w:w="9866"/>
+            <w:tcBorders>
+              <w:top w:val="none" w:color="FFFFFF" w:sz="0"/>
+              <w:left w:val="single" w:color="B5B5B5" w:sz="24"/>
+              <w:bottom w:val="none" w:color="FFFFFF" w:sz="0"/>
+              <w:right w:val="none" w:color="FFFFFF" w:sz="0"/>
+            </w:tcBorders>
+            <w:shd w:fill="FFFFFF" w:color="auto" w:val="clear"/>
+            <w:tcMar>
+              <w:top w:type="dxa" w:w="60"/>
+              <w:left w:type="dxa" w:w="100"/>
+              <w:bottom w:type="dxa" w:w="60"/>
+              <w:right w:type="dxa" w:w="100"/>
+            </w:tcMar>
+            <w:vAlign w:val="top"/>
+          </w:tcPr>
+          <w:p>
+            <w:pPr>
+              <w:spacing w:after="40" w:before="0" w:line="340"/>
+            </w:pPr>
+            <w:r>
+              <w:rPr>
+                <w:rFonts w:ascii="Malgun Gothic" w:cs="Malgun Gothic" w:eastAsia="Malgun Gothic" w:hAnsi="Malgun Gothic"/>
+                <w:color w:val="111111"/>
+                <w:sz w:val="19"/>
+                <w:szCs w:val="19"/>
+              </w:rPr>
+              <w:t xml:space="preserve">I will not be able to give a speech because I have a very important overseas business trip scheduling during that time.</w:t>
+            </w:r>
+          </w:p>
+        </w:tc>
+      </w:tr>
+    </w:tbl>
+    <w:p>
+      <w:pPr>
+        <w:spacing w:after="60" w:before="0" w:line="300"/>
+      </w:pPr>
+      <w:r>
+        <w:rPr>
+          <w:rFonts w:ascii="Malgun Gothic" w:cs="Malgun Gothic" w:eastAsia="Malgun Gothic" w:hAnsi="Malgun Gothic"/>
+          <w:color w:val="111111"/>
+          <w:sz w:val="20"/>
+          <w:szCs w:val="20"/>
+        </w:rPr>
+        <w:t xml:space="preserve"/>
+      </w:r>
+    </w:p>
+    <w:p>
+      <w:pPr>
+        <w:spacing w:after="40" w:before="60" w:line="300"/>
+      </w:pPr>
+      <w:r>
+        <w:rPr>
+          <w:rFonts w:ascii="Malgun Gothic" w:cs="Malgun Gothic" w:eastAsia="Malgun Gothic" w:hAnsi="Malgun Gothic"/>
+          <w:color w:val="111111"/>
+          <w:sz w:val="19"/>
+          <w:szCs w:val="19"/>
+        </w:rPr>
+        <w:t xml:space="preserve">정답  </w:t>
+      </w:r>
+      <w:r>
+        <w:rPr>
+          <w:rFonts w:ascii="Malgun Gothic" w:cs="Malgun Gothic" w:eastAsia="Malgun Gothic" w:hAnsi="Malgun Gothic"/>
+          <w:b/>
+          <w:bCs/>
+          <w:color w:val="B3261E"/>
+          <w:sz w:val="19"/>
+          <w:szCs w:val="19"/>
+        </w:rPr>
+        <w:t xml:space="preserve">scheduling → scheduled</w:t>
+      </w:r>
+    </w:p>
+    <w:tbl>
+      <w:tblPr>
+        <w:tblW w:type="dxa" w:w="9866"/>
+        <w:tblBorders>
+          <w:top w:val="single" w:color="auto" w:sz="4"/>
+          <w:left w:val="single" w:color="auto" w:sz="4"/>
+          <w:bottom w:val="single" w:color="auto" w:sz="4"/>
+          <w:right w:val="single" w:color="auto" w:sz="4"/>
+          <w:insideH w:val="single" w:color="auto" w:sz="4"/>
+          <w:insideV w:val="single" w:color="auto" w:sz="4"/>
+        </w:tblBorders>
+      </w:tblPr>
+      <w:tblGrid>
+        <w:gridCol w:w="9866"/>
+      </w:tblGrid>
+      <w:tr>
+        <w:tc>
+          <w:tcPr>
+            <w:tcW w:type="dxa" w:w="9866"/>
+            <w:tcBorders>
+              <w:top w:val="none" w:color="FFFFFF" w:sz="0"/>
+              <w:left w:val="single" w:color="111111" w:sz="24"/>
+              <w:bottom w:val="none" w:color="FFFFFF" w:sz="0"/>
+              <w:right w:val="none" w:color="FFFFFF" w:sz="0"/>
+            </w:tcBorders>
+            <w:shd w:fill="F3F3F3" w:color="auto" w:val="clear"/>
+            <w:tcMar>
+              <w:top w:type="dxa" w:w="60"/>
+              <w:left w:type="dxa" w:w="100"/>
+              <w:bottom w:type="dxa" w:w="60"/>
+              <w:right w:type="dxa" w:w="100"/>
+            </w:tcMar>
+            <w:vAlign w:val="top"/>
+          </w:tcPr>
+          <w:p>
+            <w:pPr>
+              <w:spacing w:after="30" w:before="0" w:line="300"/>
+            </w:pPr>
+            <w:r>
+              <w:rPr>
+                <w:rFonts w:ascii="Malgun Gothic" w:cs="Malgun Gothic" w:eastAsia="Malgun Gothic" w:hAnsi="Malgun Gothic"/>
+                <w:color w:val="111111"/>
+                <w:sz w:val="17"/>
+                <w:szCs w:val="17"/>
+              </w:rPr>
+              <w:t xml:space="preserve">출장(a trip)은 '예정되는' 대상이므로 목적격보어는 과거분사.</w:t>
+            </w:r>
+          </w:p>
+        </w:tc>
+      </w:tr>
+    </w:tbl>
+    <w:p>
+      <w:pPr>
+        <w:keepNext/>
+        <w:spacing w:after="80" w:before="200" w:line="300"/>
+      </w:pPr>
+      <w:r>
+        <w:rPr>
+          <w:rFonts w:ascii="Malgun Gothic" w:cs="Malgun Gothic" w:eastAsia="Malgun Gothic" w:hAnsi="Malgun Gothic"/>
+          <w:b/>
+          <w:bCs/>
+          <w:color w:val="111111"/>
+          <w:sz w:val="21"/>
+          <w:szCs w:val="21"/>
+        </w:rPr>
+        <w:t xml:space="preserve">2. </w:t>
+      </w:r>
+      <w:r>
+        <w:rPr>
+          <w:rFonts w:ascii="Malgun Gothic" w:cs="Malgun Gothic" w:eastAsia="Malgun Gothic" w:hAnsi="Malgun Gothic"/>
+          <w:b/>
+          <w:bCs/>
+          <w:color w:val="111111"/>
+          <w:sz w:val="20"/>
+          <w:szCs w:val="20"/>
+        </w:rPr>
+        <w:t xml:space="preserve">다음 중 어법상 옳은 문장은?</w:t>
+      </w:r>
+      <w:r>
+        <w:rPr>
+          <w:rFonts w:ascii="Malgun Gothic" w:cs="Malgun Gothic" w:eastAsia="Malgun Gothic" w:hAnsi="Malgun Gothic"/>
+          <w:color w:val="6B6B6B"/>
+          <w:sz w:val="15"/>
+          <w:szCs w:val="15"/>
+        </w:rPr>
+        <w:t xml:space="preserve">  [어법]</w:t>
+      </w:r>
+    </w:p>
+    <w:p>
+      <w:pPr>
+        <w:spacing w:after="30" w:before="0" w:line="300"/>
+        <w:ind w:left="200"/>
+      </w:pPr>
+      <w:r>
+        <w:rPr>
+          <w:rFonts w:ascii="Malgun Gothic" w:cs="Malgun Gothic" w:eastAsia="Malgun Gothic" w:hAnsi="Malgun Gothic"/>
+          <w:color w:val="111111"/>
+          <w:sz w:val="19"/>
+          <w:szCs w:val="19"/>
+        </w:rPr>
+        <w:t xml:space="preserve">① I had my car wash yesterday.</w:t>
+      </w:r>
+    </w:p>
+    <w:p>
+      <w:pPr>
+        <w:spacing w:after="30" w:before="0" w:line="300"/>
+        <w:ind w:left="200"/>
+      </w:pPr>
+      <w:r>
+        <w:rPr>
+          <w:rFonts w:ascii="Malgun Gothic" w:cs="Malgun Gothic" w:eastAsia="Malgun Gothic" w:hAnsi="Malgun Gothic"/>
+          <w:color w:val="111111"/>
+          <w:sz w:val="19"/>
+          <w:szCs w:val="19"/>
+        </w:rPr>
+        <w:t xml:space="preserve">② She had her son cleaned his room.</w:t>
+      </w:r>
+    </w:p>
+    <w:p>
+      <w:pPr>
+        <w:spacing w:after="30" w:before="0" w:line="300"/>
+        <w:ind w:left="200"/>
+      </w:pPr>
+      <w:r>
+        <w:rPr>
+          <w:rFonts w:ascii="Malgun Gothic" w:cs="Malgun Gothic" w:eastAsia="Malgun Gothic" w:hAnsi="Malgun Gothic"/>
+          <w:color w:val="111111"/>
+          <w:sz w:val="19"/>
+          <w:szCs w:val="19"/>
+        </w:rPr>
+        <w:t xml:space="preserve">③ He has a meeting scheduled for Monday.</w:t>
+      </w:r>
+    </w:p>
+    <w:p>
+      <w:pPr>
+        <w:spacing w:after="30" w:before="0" w:line="300"/>
+        <w:ind w:left="200"/>
+      </w:pPr>
+      <w:r>
+        <w:rPr>
+          <w:rFonts w:ascii="Malgun Gothic" w:cs="Malgun Gothic" w:eastAsia="Malgun Gothic" w:hAnsi="Malgun Gothic"/>
+          <w:color w:val="111111"/>
+          <w:sz w:val="19"/>
+          <w:szCs w:val="19"/>
+        </w:rPr>
+        <w:t xml:space="preserve">④ We had the roof repair last week.</w:t>
+      </w:r>
+    </w:p>
+    <w:p>
+      <w:pPr>
+        <w:spacing w:after="30" w:before="0" w:line="300"/>
+        <w:ind w:left="200"/>
+      </w:pPr>
+      <w:r>
+        <w:rPr>
+          <w:rFonts w:ascii="Malgun Gothic" w:cs="Malgun Gothic" w:eastAsia="Malgun Gothic" w:hAnsi="Malgun Gothic"/>
+          <w:color w:val="111111"/>
+          <w:sz w:val="19"/>
+          <w:szCs w:val="19"/>
+        </w:rPr>
+        <w:t xml:space="preserve">⑤ They had the kids waited outside.</w:t>
+      </w:r>
+    </w:p>
+    <w:p>
+      <w:pPr>
+        <w:spacing w:after="40" w:before="60" w:line="300"/>
+      </w:pPr>
+      <w:r>
+        <w:rPr>
+          <w:rFonts w:ascii="Malgun Gothic" w:cs="Malgun Gothic" w:eastAsia="Malgun Gothic" w:hAnsi="Malgun Gothic"/>
+          <w:color w:val="111111"/>
+          <w:sz w:val="19"/>
+          <w:szCs w:val="19"/>
+        </w:rPr>
+        <w:t xml:space="preserve">정답  </w:t>
+      </w:r>
+      <w:r>
+        <w:rPr>
+          <w:rFonts w:ascii="Malgun Gothic" w:cs="Malgun Gothic" w:eastAsia="Malgun Gothic" w:hAnsi="Malgun Gothic"/>
+          <w:b/>
+          <w:bCs/>
+          <w:color w:val="B3261E"/>
+          <w:sz w:val="19"/>
+          <w:szCs w:val="19"/>
+        </w:rPr>
+        <w:t xml:space="preserve">③ He has a meeting scheduled for Monday.</w:t>
+      </w:r>
+    </w:p>
+    <w:tbl>
+      <w:tblPr>
+        <w:tblW w:type="dxa" w:w="9866"/>
+        <w:tblBorders>
+          <w:top w:val="single" w:color="auto" w:sz="4"/>
+          <w:left w:val="single" w:color="auto" w:sz="4"/>
+          <w:bottom w:val="single" w:color="auto" w:sz="4"/>
+          <w:right w:val="single" w:color="auto" w:sz="4"/>
+          <w:insideH w:val="single" w:color="auto" w:sz="4"/>
+          <w:insideV w:val="single" w:color="auto" w:sz="4"/>
+        </w:tblBorders>
+      </w:tblPr>
+      <w:tblGrid>
+        <w:gridCol w:w="9866"/>
+      </w:tblGrid>
+      <w:tr>
+        <w:tc>
+          <w:tcPr>
+            <w:tcW w:type="dxa" w:w="9866"/>
+            <w:tcBorders>
+              <w:top w:val="none" w:color="FFFFFF" w:sz="0"/>
+              <w:left w:val="single" w:color="111111" w:sz="24"/>
+              <w:bottom w:val="none" w:color="FFFFFF" w:sz="0"/>
+              <w:right w:val="none" w:color="FFFFFF" w:sz="0"/>
+            </w:tcBorders>
+            <w:shd w:fill="F3F3F3" w:color="auto" w:val="clear"/>
+            <w:tcMar>
+              <w:top w:type="dxa" w:w="60"/>
+              <w:left w:type="dxa" w:w="100"/>
+              <w:bottom w:type="dxa" w:w="60"/>
+              <w:right w:type="dxa" w:w="100"/>
+            </w:tcMar>
+            <w:vAlign w:val="top"/>
+          </w:tcPr>
+          <w:p>
+            <w:pPr>
+              <w:spacing w:after="30" w:before="0" w:line="300"/>
+            </w:pPr>
+            <w:r>
+              <w:rPr>
+                <w:rFonts w:ascii="Malgun Gothic" w:cs="Malgun Gothic" w:eastAsia="Malgun Gothic" w:hAnsi="Malgun Gothic"/>
+                <w:color w:val="111111"/>
+                <w:sz w:val="17"/>
+                <w:szCs w:val="17"/>
+              </w:rPr>
+              <w:t xml:space="preserve">① wash→washed ② cleaned→clean ④ repair→repaired ⑤ waited→wait/waiting</w:t>
+            </w:r>
+          </w:p>
+        </w:tc>
+      </w:tr>
+    </w:tbl>
+    <w:p>
+      <w:pPr>
+        <w:keepNext/>
+        <w:spacing w:after="60" w:before="240" w:line="300"/>
+      </w:pPr>
+      <w:r>
+        <w:rPr>
+          <w:rFonts w:ascii="Malgun Gothic" w:cs="Malgun Gothic" w:eastAsia="Malgun Gothic" w:hAnsi="Malgun Gothic"/>
+          <w:b/>
+          <w:bCs/>
+          <w:color w:val="FFFFFF"/>
+          <w:sz w:val="17"/>
+          <w:szCs w:val="17"/>
+          <w:shd w:fill="B3261E" w:color="auto" w:val="clear"/>
+        </w:rPr>
+        <w:t xml:space="preserve"> POINT 3 </w:t>
+      </w:r>
+      <w:r>
+        <w:rPr>
+          <w:rFonts w:ascii="Malgun Gothic" w:cs="Malgun Gothic" w:eastAsia="Malgun Gothic" w:hAnsi="Malgun Gothic"/>
+          <w:b/>
+          <w:bCs/>
+          <w:color w:val="111111"/>
+          <w:sz w:val="22"/>
+          <w:szCs w:val="22"/>
+        </w:rPr>
+        <w:t xml:space="preserve">  decline 다의어 + 거절 표현</w:t>
+      </w:r>
+      <w:r>
+        <w:rPr>
+          <w:rFonts w:ascii="Malgun Gothic" w:cs="Malgun Gothic" w:eastAsia="Malgun Gothic" w:hAnsi="Malgun Gothic"/>
+          <w:color w:val="6B6B6B"/>
+          <w:sz w:val="16"/>
+          <w:szCs w:val="16"/>
+        </w:rPr>
+        <w:t xml:space="preserve">   [5번 문장]</w:t>
+      </w:r>
+    </w:p>
+    <w:p>
+      <w:pPr>
+        <w:keepNext/>
+        <w:spacing w:after="60" w:before="0" w:line="300"/>
+      </w:pPr>
+      <w:r>
+        <w:rPr>
+          <w:rFonts w:ascii="Malgun Gothic" w:cs="Malgun Gothic" w:eastAsia="Malgun Gothic" w:hAnsi="Malgun Gothic"/>
+          <w:color w:val="6B6B6B"/>
+          <w:sz w:val="17"/>
+          <w:szCs w:val="17"/>
+        </w:rPr>
+        <w:t xml:space="preserve">왜 중요? decline은 '거절하다/감소하다' 두 뜻이 모두 수능 빈출이라 문맥상 의미 문제로 내기 좋다.</w:t>
+      </w:r>
+    </w:p>
+    <w:tbl>
+      <w:tblPr>
+        <w:tblW w:type="dxa" w:w="9866"/>
+        <w:tblBorders>
+          <w:top w:val="single" w:color="auto" w:sz="4"/>
+          <w:left w:val="single" w:color="auto" w:sz="4"/>
+          <w:bottom w:val="single" w:color="auto" w:sz="4"/>
+          <w:right w:val="single" w:color="auto" w:sz="4"/>
+          <w:insideH w:val="single" w:color="auto" w:sz="4"/>
+          <w:insideV w:val="single" w:color="auto" w:sz="4"/>
+        </w:tblBorders>
+      </w:tblPr>
+      <w:tblGrid>
+        <w:gridCol w:w="9866"/>
+      </w:tblGrid>
+      <w:tr>
+        <w:tc>
+          <w:tcPr>
+            <w:tcW w:type="dxa" w:w="9866"/>
+            <w:tcBorders>
+              <w:top w:val="none" w:color="FFFFFF" w:sz="0"/>
+              <w:left w:val="single" w:color="111111" w:sz="24"/>
+              <w:bottom w:val="none" w:color="FFFFFF" w:sz="0"/>
+              <w:right w:val="none" w:color="FFFFFF" w:sz="0"/>
+            </w:tcBorders>
+            <w:shd w:fill="F3F3F3" w:color="auto" w:val="clear"/>
+            <w:tcMar>
+              <w:top w:type="dxa" w:w="60"/>
+              <w:left w:type="dxa" w:w="100"/>
+              <w:bottom w:type="dxa" w:w="60"/>
+              <w:right w:type="dxa" w:w="100"/>
+            </w:tcMar>
+            <w:vAlign w:val="top"/>
+          </w:tcPr>
+          <w:p>
+            <w:pPr>
+              <w:spacing w:after="60" w:before="0" w:line="300"/>
+            </w:pPr>
+            <w:r>
+              <w:rPr>
+                <w:rFonts w:ascii="Malgun Gothic" w:cs="Malgun Gothic" w:eastAsia="Malgun Gothic" w:hAnsi="Malgun Gothic"/>
+                <w:b/>
+                <w:bCs/>
+                <w:color w:val="111111"/>
+                <w:sz w:val="19"/>
+                <w:szCs w:val="19"/>
+              </w:rPr>
+              <w:t xml:space="preserve">정리</w:t>
+            </w:r>
+          </w:p>
+          <w:p>
+            <w:pPr>
+              <w:spacing w:after="40" w:before="0" w:line="300"/>
+            </w:pPr>
+            <w:r>
+              <w:rPr>
+                <w:rFonts w:ascii="Malgun Gothic" w:cs="Malgun Gothic" w:eastAsia="Malgun Gothic" w:hAnsi="Malgun Gothic"/>
+                <w:color w:val="111111"/>
+                <w:sz w:val="18"/>
+                <w:szCs w:val="18"/>
+              </w:rPr>
+              <w:t xml:space="preserve">v. 거절하다 = refuse, reject, turn down ↔ accept (본문)</w:t>
+            </w:r>
+          </w:p>
+          <w:p>
+            <w:pPr>
+              <w:spacing w:after="40" w:before="0" w:line="300"/>
+            </w:pPr>
+            <w:r>
+              <w:rPr>
+                <w:rFonts w:ascii="Malgun Gothic" w:cs="Malgun Gothic" w:eastAsia="Malgun Gothic" w:hAnsi="Malgun Gothic"/>
+                <w:color w:val="111111"/>
+                <w:sz w:val="18"/>
+                <w:szCs w:val="18"/>
+              </w:rPr>
+              <w:t xml:space="preserve">v. 감소하다, 쇠퇴하다 = decrease, drop, fall ↔ increase</w:t>
+            </w:r>
+          </w:p>
+          <w:p>
+            <w:pPr>
+              <w:spacing w:after="40" w:before="0" w:line="300"/>
+            </w:pPr>
+            <w:r>
+              <w:rPr>
+                <w:rFonts w:ascii="Malgun Gothic" w:cs="Malgun Gothic" w:eastAsia="Malgun Gothic" w:hAnsi="Malgun Gothic"/>
+                <w:color w:val="111111"/>
+                <w:sz w:val="18"/>
+                <w:szCs w:val="18"/>
+              </w:rPr>
+              <w:t xml:space="preserve">n. 감소, 하락: a sharp decline in sales</w:t>
+            </w:r>
+          </w:p>
+          <w:p>
+            <w:pPr>
+              <w:spacing w:after="40" w:before="0" w:line="300"/>
+            </w:pPr>
+            <w:r>
+              <w:rPr>
+                <w:rFonts w:ascii="Malgun Gothic" w:cs="Malgun Gothic" w:eastAsia="Malgun Gothic" w:hAnsi="Malgun Gothic"/>
+                <w:color w:val="111111"/>
+                <w:sz w:val="18"/>
+                <w:szCs w:val="18"/>
+              </w:rPr>
+              <w:t xml:space="preserve">정중한 거절 표현: I would have loved to ~, but ... / I'm afraid I can't ~ / I must decline ~</w:t>
+            </w:r>
+          </w:p>
+        </w:tc>
+      </w:tr>
+    </w:tbl>
+    <w:p>
+      <w:pPr>
+        <w:spacing w:after="60" w:before="0" w:line="300"/>
+      </w:pPr>
+      <w:r>
+        <w:rPr>
+          <w:rFonts w:ascii="Malgun Gothic" w:cs="Malgun Gothic" w:eastAsia="Malgun Gothic" w:hAnsi="Malgun Gothic"/>
+          <w:color w:val="111111"/>
+          <w:sz w:val="20"/>
+          <w:szCs w:val="20"/>
+        </w:rPr>
+        <w:t xml:space="preserve"/>
+      </w:r>
+    </w:p>
+    <w:p>
+      <w:pPr>
+        <w:keepNext/>
+        <w:spacing w:after="0" w:before="60" w:line="300"/>
+      </w:pPr>
+      <w:r>
+        <w:rPr>
+          <w:rFonts w:ascii="Malgun Gothic" w:cs="Malgun Gothic" w:eastAsia="Malgun Gothic" w:hAnsi="Malgun Gothic"/>
+          <w:b/>
+          <w:bCs/>
+          <w:color w:val="111111"/>
+          <w:sz w:val="19"/>
+          <w:szCs w:val="19"/>
+        </w:rPr>
+        <w:t xml:space="preserve">▶ 이렇게 내면 된다</w:t>
+      </w:r>
+    </w:p>
+    <w:p>
+      <w:pPr>
+        <w:keepNext/>
+        <w:spacing w:after="80" w:before="200" w:line="300"/>
+      </w:pPr>
+      <w:r>
+        <w:rPr>
+          <w:rFonts w:ascii="Malgun Gothic" w:cs="Malgun Gothic" w:eastAsia="Malgun Gothic" w:hAnsi="Malgun Gothic"/>
+          <w:b/>
+          <w:bCs/>
+          <w:color w:val="111111"/>
+          <w:sz w:val="21"/>
+          <w:szCs w:val="21"/>
+        </w:rPr>
+        <w:t xml:space="preserve">1. </w:t>
+      </w:r>
+      <w:r>
+        <w:rPr>
+          <w:rFonts w:ascii="Malgun Gothic" w:cs="Malgun Gothic" w:eastAsia="Malgun Gothic" w:hAnsi="Malgun Gothic"/>
+          <w:b/>
+          <w:bCs/>
+          <w:color w:val="111111"/>
+          <w:sz w:val="20"/>
+          <w:szCs w:val="20"/>
+        </w:rPr>
+        <w:t xml:space="preserve">밑줄 친 </w:t>
+      </w:r>
+      <w:r>
+        <w:rPr>
+          <w:rFonts w:ascii="Malgun Gothic" w:cs="Malgun Gothic" w:eastAsia="Malgun Gothic" w:hAnsi="Malgun Gothic"/>
+          <w:b/>
+          <w:bCs/>
+          <w:color w:val="111111"/>
+          <w:sz w:val="20"/>
+          <w:szCs w:val="20"/>
+          <w:u w:val="single"/>
+        </w:rPr>
+        <w:t xml:space="preserve">decline</w:t>
+      </w:r>
+      <w:r>
+        <w:rPr>
+          <w:rFonts w:ascii="Malgun Gothic" w:cs="Malgun Gothic" w:eastAsia="Malgun Gothic" w:hAnsi="Malgun Gothic"/>
+          <w:b/>
+          <w:bCs/>
+          <w:color w:val="111111"/>
+          <w:sz w:val="20"/>
+          <w:szCs w:val="20"/>
+        </w:rPr>
+        <w:t xml:space="preserve">과 같은 의미로 쓰인 것은?</w:t>
+      </w:r>
+      <w:r>
+        <w:rPr>
+          <w:rFonts w:ascii="Malgun Gothic" w:cs="Malgun Gothic" w:eastAsia="Malgun Gothic" w:hAnsi="Malgun Gothic"/>
+          <w:color w:val="6B6B6B"/>
+          <w:sz w:val="15"/>
+          <w:szCs w:val="15"/>
+        </w:rPr>
+        <w:t xml:space="preserve">  [어휘(문맥상 의미)]</w:t>
+      </w:r>
+    </w:p>
+    <w:tbl>
+      <w:tblPr>
+        <w:tblW w:type="dxa" w:w="9866"/>
+        <w:tblBorders>
+          <w:top w:val="single" w:color="auto" w:sz="4"/>
+          <w:left w:val="single" w:color="auto" w:sz="4"/>
+          <w:bottom w:val="single" w:color="auto" w:sz="4"/>
+          <w:right w:val="single" w:color="auto" w:sz="4"/>
+          <w:insideH w:val="single" w:color="auto" w:sz="4"/>
+          <w:insideV w:val="single" w:color="auto" w:sz="4"/>
+        </w:tblBorders>
+      </w:tblPr>
+      <w:tblGrid>
+        <w:gridCol w:w="9866"/>
+      </w:tblGrid>
+      <w:tr>
+        <w:tc>
+          <w:tcPr>
+            <w:tcW w:type="dxa" w:w="9866"/>
+            <w:tcBorders>
+              <w:top w:val="none" w:color="FFFFFF" w:sz="0"/>
+              <w:left w:val="single" w:color="B5B5B5" w:sz="24"/>
+              <w:bottom w:val="none" w:color="FFFFFF" w:sz="0"/>
+              <w:right w:val="none" w:color="FFFFFF" w:sz="0"/>
+            </w:tcBorders>
+            <w:shd w:fill="FFFFFF" w:color="auto" w:val="clear"/>
+            <w:tcMar>
+              <w:top w:type="dxa" w:w="60"/>
+              <w:left w:type="dxa" w:w="100"/>
+              <w:bottom w:type="dxa" w:w="60"/>
+              <w:right w:type="dxa" w:w="100"/>
+            </w:tcMar>
+            <w:vAlign w:val="top"/>
+          </w:tcPr>
+          <w:p>
+            <w:pPr>
+              <w:spacing w:after="40" w:before="0" w:line="340"/>
+            </w:pPr>
+            <w:r>
+              <w:rPr>
+                <w:rFonts w:ascii="Malgun Gothic" w:cs="Malgun Gothic" w:eastAsia="Malgun Gothic" w:hAnsi="Malgun Gothic"/>
+                <w:color w:val="111111"/>
+                <w:sz w:val="19"/>
+                <w:szCs w:val="19"/>
+              </w:rPr>
+              <w:t xml:space="preserve">I would have loved to speak to the graduating students, but I must </w:t>
+            </w:r>
+            <w:r>
+              <w:rPr>
+                <w:rFonts w:ascii="Malgun Gothic" w:cs="Malgun Gothic" w:eastAsia="Malgun Gothic" w:hAnsi="Malgun Gothic"/>
+                <w:color w:val="111111"/>
+                <w:sz w:val="19"/>
+                <w:szCs w:val="19"/>
+                <w:u w:val="single"/>
+              </w:rPr>
+              <w:t xml:space="preserve">decline</w:t>
+            </w:r>
+            <w:r>
+              <w:rPr>
+                <w:rFonts w:ascii="Malgun Gothic" w:cs="Malgun Gothic" w:eastAsia="Malgun Gothic" w:hAnsi="Malgun Gothic"/>
+                <w:color w:val="111111"/>
+                <w:sz w:val="19"/>
+                <w:szCs w:val="19"/>
+              </w:rPr>
+              <w:t xml:space="preserve"> your invitation to this meaningful celebration.</w:t>
+            </w:r>
+          </w:p>
+        </w:tc>
+      </w:tr>
+    </w:tbl>
+    <w:p>
+      <w:pPr>
+        <w:spacing w:after="60" w:before="0" w:line="300"/>
+      </w:pPr>
+      <w:r>
+        <w:rPr>
+          <w:rFonts w:ascii="Malgun Gothic" w:cs="Malgun Gothic" w:eastAsia="Malgun Gothic" w:hAnsi="Malgun Gothic"/>
+          <w:color w:val="111111"/>
+          <w:sz w:val="20"/>
+          <w:szCs w:val="20"/>
+        </w:rPr>
+        <w:t xml:space="preserve"/>
+      </w:r>
+    </w:p>
+    <w:p>
+      <w:pPr>
+        <w:spacing w:after="30" w:before="0" w:line="300"/>
+        <w:ind w:left="200"/>
+      </w:pPr>
+      <w:r>
+        <w:rPr>
+          <w:rFonts w:ascii="Malgun Gothic" w:cs="Malgun Gothic" w:eastAsia="Malgun Gothic" w:hAnsi="Malgun Gothic"/>
+          <w:color w:val="111111"/>
+          <w:sz w:val="19"/>
+          <w:szCs w:val="19"/>
+        </w:rPr>
+        <w:t xml:space="preserve">① The number of students has begun to </w:t>
+      </w:r>
+      <w:r>
+        <w:rPr>
+          <w:rFonts w:ascii="Malgun Gothic" w:cs="Malgun Gothic" w:eastAsia="Malgun Gothic" w:hAnsi="Malgun Gothic"/>
+          <w:color w:val="111111"/>
+          <w:sz w:val="19"/>
+          <w:szCs w:val="19"/>
+          <w:u w:val="single"/>
+        </w:rPr>
+        <w:t xml:space="preserve">decline</w:t>
+      </w:r>
+      <w:r>
+        <w:rPr>
+          <w:rFonts w:ascii="Malgun Gothic" w:cs="Malgun Gothic" w:eastAsia="Malgun Gothic" w:hAnsi="Malgun Gothic"/>
+          <w:color w:val="111111"/>
+          <w:sz w:val="19"/>
+          <w:szCs w:val="19"/>
+        </w:rPr>
+        <w:t xml:space="preserve">.</w:t>
+      </w:r>
+    </w:p>
+    <w:p>
+      <w:pPr>
+        <w:spacing w:after="30" w:before="0" w:line="300"/>
+        <w:ind w:left="200"/>
+      </w:pPr>
+      <w:r>
+        <w:rPr>
+          <w:rFonts w:ascii="Malgun Gothic" w:cs="Malgun Gothic" w:eastAsia="Malgun Gothic" w:hAnsi="Malgun Gothic"/>
+          <w:color w:val="111111"/>
+          <w:sz w:val="19"/>
+          <w:szCs w:val="19"/>
+        </w:rPr>
+        <w:t xml:space="preserve">② Her health </w:t>
+      </w:r>
+      <w:r>
+        <w:rPr>
+          <w:rFonts w:ascii="Malgun Gothic" w:cs="Malgun Gothic" w:eastAsia="Malgun Gothic" w:hAnsi="Malgun Gothic"/>
+          <w:color w:val="111111"/>
+          <w:sz w:val="19"/>
+          <w:szCs w:val="19"/>
+          <w:u w:val="single"/>
+        </w:rPr>
+        <w:t xml:space="preserve">declined</w:t>
+      </w:r>
+      <w:r>
+        <w:rPr>
+          <w:rFonts w:ascii="Malgun Gothic" w:cs="Malgun Gothic" w:eastAsia="Malgun Gothic" w:hAnsi="Malgun Gothic"/>
+          <w:color w:val="111111"/>
+          <w:sz w:val="19"/>
+          <w:szCs w:val="19"/>
+        </w:rPr>
+        <w:t xml:space="preserve"> rapidly last winter.</w:t>
+      </w:r>
+    </w:p>
+    <w:p>
+      <w:pPr>
+        <w:spacing w:after="30" w:before="0" w:line="300"/>
+        <w:ind w:left="200"/>
+      </w:pPr>
+      <w:r>
+        <w:rPr>
+          <w:rFonts w:ascii="Malgun Gothic" w:cs="Malgun Gothic" w:eastAsia="Malgun Gothic" w:hAnsi="Malgun Gothic"/>
+          <w:color w:val="111111"/>
+          <w:sz w:val="19"/>
+          <w:szCs w:val="19"/>
+        </w:rPr>
+        <w:t xml:space="preserve">③ He politely </w:t>
+      </w:r>
+      <w:r>
+        <w:rPr>
+          <w:rFonts w:ascii="Malgun Gothic" w:cs="Malgun Gothic" w:eastAsia="Malgun Gothic" w:hAnsi="Malgun Gothic"/>
+          <w:color w:val="111111"/>
+          <w:sz w:val="19"/>
+          <w:szCs w:val="19"/>
+          <w:u w:val="single"/>
+        </w:rPr>
+        <w:t xml:space="preserve">declined</w:t>
+      </w:r>
+      <w:r>
+        <w:rPr>
+          <w:rFonts w:ascii="Malgun Gothic" w:cs="Malgun Gothic" w:eastAsia="Malgun Gothic" w:hAnsi="Malgun Gothic"/>
+          <w:color w:val="111111"/>
+          <w:sz w:val="19"/>
+          <w:szCs w:val="19"/>
+        </w:rPr>
+        <w:t xml:space="preserve"> the job offer.</w:t>
+      </w:r>
+    </w:p>
+    <w:p>
+      <w:pPr>
+        <w:spacing w:after="30" w:before="0" w:line="300"/>
+        <w:ind w:left="200"/>
+      </w:pPr>
+      <w:r>
+        <w:rPr>
+          <w:rFonts w:ascii="Malgun Gothic" w:cs="Malgun Gothic" w:eastAsia="Malgun Gothic" w:hAnsi="Malgun Gothic"/>
+          <w:color w:val="111111"/>
+          <w:sz w:val="19"/>
+          <w:szCs w:val="19"/>
+        </w:rPr>
+        <w:t xml:space="preserve">④ Sales showed a sharp </w:t>
+      </w:r>
+      <w:r>
+        <w:rPr>
+          <w:rFonts w:ascii="Malgun Gothic" w:cs="Malgun Gothic" w:eastAsia="Malgun Gothic" w:hAnsi="Malgun Gothic"/>
+          <w:color w:val="111111"/>
+          <w:sz w:val="19"/>
+          <w:szCs w:val="19"/>
+          <w:u w:val="single"/>
+        </w:rPr>
+        <w:t xml:space="preserve">decline</w:t>
+      </w:r>
+      <w:r>
+        <w:rPr>
+          <w:rFonts w:ascii="Malgun Gothic" w:cs="Malgun Gothic" w:eastAsia="Malgun Gothic" w:hAnsi="Malgun Gothic"/>
+          <w:color w:val="111111"/>
+          <w:sz w:val="19"/>
+          <w:szCs w:val="19"/>
+        </w:rPr>
+        <w:t xml:space="preserve"> this year.</w:t>
+      </w:r>
+    </w:p>
+    <w:p>
+      <w:pPr>
+        <w:spacing w:after="30" w:before="0" w:line="300"/>
+        <w:ind w:left="200"/>
+      </w:pPr>
+      <w:r>
+        <w:rPr>
+          <w:rFonts w:ascii="Malgun Gothic" w:cs="Malgun Gothic" w:eastAsia="Malgun Gothic" w:hAnsi="Malgun Gothic"/>
+          <w:color w:val="111111"/>
+          <w:sz w:val="19"/>
+          <w:szCs w:val="19"/>
+        </w:rPr>
+        <w:t xml:space="preserve">⑤ The birth rate continues to </w:t>
+      </w:r>
+      <w:r>
+        <w:rPr>
+          <w:rFonts w:ascii="Malgun Gothic" w:cs="Malgun Gothic" w:eastAsia="Malgun Gothic" w:hAnsi="Malgun Gothic"/>
+          <w:color w:val="111111"/>
+          <w:sz w:val="19"/>
+          <w:szCs w:val="19"/>
+          <w:u w:val="single"/>
+        </w:rPr>
+        <w:t xml:space="preserve">decline</w:t>
+      </w:r>
+      <w:r>
+        <w:rPr>
+          <w:rFonts w:ascii="Malgun Gothic" w:cs="Malgun Gothic" w:eastAsia="Malgun Gothic" w:hAnsi="Malgun Gothic"/>
+          <w:color w:val="111111"/>
+          <w:sz w:val="19"/>
+          <w:szCs w:val="19"/>
+        </w:rPr>
+        <w:t xml:space="preserve">.</w:t>
+      </w:r>
+    </w:p>
+    <w:p>
+      <w:pPr>
+        <w:spacing w:after="40" w:before="60" w:line="300"/>
+      </w:pPr>
+      <w:r>
+        <w:rPr>
+          <w:rFonts w:ascii="Malgun Gothic" w:cs="Malgun Gothic" w:eastAsia="Malgun Gothic" w:hAnsi="Malgun Gothic"/>
+          <w:color w:val="111111"/>
+          <w:sz w:val="19"/>
+          <w:szCs w:val="19"/>
+        </w:rPr>
+        <w:t xml:space="preserve">정답  </w:t>
+      </w:r>
+      <w:r>
+        <w:rPr>
+          <w:rFonts w:ascii="Malgun Gothic" w:cs="Malgun Gothic" w:eastAsia="Malgun Gothic" w:hAnsi="Malgun Gothic"/>
+          <w:b/>
+          <w:bCs/>
+          <w:color w:val="B3261E"/>
+          <w:sz w:val="19"/>
+          <w:szCs w:val="19"/>
+        </w:rPr>
+        <w:t xml:space="preserve">③ He politely declined the job offer.</w:t>
+      </w:r>
+    </w:p>
+    <w:tbl>
+      <w:tblPr>
+        <w:tblW w:type="dxa" w:w="9866"/>
+        <w:tblBorders>
+          <w:top w:val="single" w:color="auto" w:sz="4"/>
+          <w:left w:val="single" w:color="auto" w:sz="4"/>
+          <w:bottom w:val="single" w:color="auto" w:sz="4"/>
+          <w:right w:val="single" w:color="auto" w:sz="4"/>
+          <w:insideH w:val="single" w:color="auto" w:sz="4"/>
+          <w:insideV w:val="single" w:color="auto" w:sz="4"/>
+        </w:tblBorders>
+      </w:tblPr>
+      <w:tblGrid>
+        <w:gridCol w:w="9866"/>
+      </w:tblGrid>
+      <w:tr>
+        <w:tc>
+          <w:tcPr>
+            <w:tcW w:type="dxa" w:w="9866"/>
+            <w:tcBorders>
+              <w:top w:val="none" w:color="FFFFFF" w:sz="0"/>
+              <w:left w:val="single" w:color="111111" w:sz="24"/>
+              <w:bottom w:val="none" w:color="FFFFFF" w:sz="0"/>
+              <w:right w:val="none" w:color="FFFFFF" w:sz="0"/>
+            </w:tcBorders>
+            <w:shd w:fill="F3F3F3" w:color="auto" w:val="clear"/>
+            <w:tcMar>
+              <w:top w:type="dxa" w:w="60"/>
+              <w:left w:type="dxa" w:w="100"/>
+              <w:bottom w:type="dxa" w:w="60"/>
+              <w:right w:type="dxa" w:w="100"/>
+            </w:tcMar>
+            <w:vAlign w:val="top"/>
+          </w:tcPr>
+          <w:p>
+            <w:pPr>
+              <w:spacing w:after="30" w:before="0" w:line="300"/>
+            </w:pPr>
+            <w:r>
+              <w:rPr>
+                <w:rFonts w:ascii="Malgun Gothic" w:cs="Malgun Gothic" w:eastAsia="Malgun Gothic" w:hAnsi="Malgun Gothic"/>
+                <w:color w:val="111111"/>
+                <w:sz w:val="17"/>
+                <w:szCs w:val="17"/>
+              </w:rPr>
+              <w:t xml:space="preserve">본문은 '거절하다'. ③만 같은 뜻. ①②⑤ 감소·쇠퇴하다(동사), ④ 감소(명사).</w:t>
+            </w:r>
+          </w:p>
+        </w:tc>
+      </w:tr>
+    </w:tbl>
+    <w:p>
+      <w:pPr>
+        <w:keepNext/>
+        <w:spacing w:after="80" w:before="200" w:line="300"/>
+      </w:pPr>
+      <w:r>
+        <w:rPr>
+          <w:rFonts w:ascii="Malgun Gothic" w:cs="Malgun Gothic" w:eastAsia="Malgun Gothic" w:hAnsi="Malgun Gothic"/>
+          <w:b/>
+          <w:bCs/>
+          <w:color w:val="111111"/>
+          <w:sz w:val="21"/>
+          <w:szCs w:val="21"/>
+        </w:rPr>
+        <w:t xml:space="preserve">2. </w:t>
+      </w:r>
+      <w:r>
+        <w:rPr>
+          <w:rFonts w:ascii="Malgun Gothic" w:cs="Malgun Gothic" w:eastAsia="Malgun Gothic" w:hAnsi="Malgun Gothic"/>
+          <w:b/>
+          <w:bCs/>
+          <w:color w:val="111111"/>
+          <w:sz w:val="20"/>
+          <w:szCs w:val="20"/>
+        </w:rPr>
+        <w:t xml:space="preserve">본문의 decline과 뜻이 같은 두 단어의 구동사를 쓰시오.</w:t>
+      </w:r>
+      <w:r>
+        <w:rPr>
+          <w:rFonts w:ascii="Malgun Gothic" w:cs="Malgun Gothic" w:eastAsia="Malgun Gothic" w:hAnsi="Malgun Gothic"/>
+          <w:color w:val="6B6B6B"/>
+          <w:sz w:val="15"/>
+          <w:szCs w:val="15"/>
+        </w:rPr>
+        <w:t xml:space="preserve">  [바꿔쓰기(서술형)]</w:t>
+      </w:r>
+    </w:p>
+    <w:p>
+      <w:pPr>
+        <w:spacing w:after="40" w:before="60" w:line="300"/>
+      </w:pPr>
+      <w:r>
+        <w:rPr>
+          <w:rFonts w:ascii="Malgun Gothic" w:cs="Malgun Gothic" w:eastAsia="Malgun Gothic" w:hAnsi="Malgun Gothic"/>
+          <w:color w:val="111111"/>
+          <w:sz w:val="19"/>
+          <w:szCs w:val="19"/>
+        </w:rPr>
+        <w:t xml:space="preserve">정답  </w:t>
+      </w:r>
+      <w:r>
+        <w:rPr>
+          <w:rFonts w:ascii="Malgun Gothic" w:cs="Malgun Gothic" w:eastAsia="Malgun Gothic" w:hAnsi="Malgun Gothic"/>
+          <w:b/>
+          <w:bCs/>
+          <w:color w:val="B3261E"/>
+          <w:sz w:val="19"/>
+          <w:szCs w:val="19"/>
+        </w:rPr>
+        <w:t xml:space="preserve">turn down</w:t>
+      </w:r>
+    </w:p>
+    <w:tbl>
+      <w:tblPr>
+        <w:tblW w:type="dxa" w:w="9866"/>
+        <w:tblBorders>
+          <w:top w:val="single" w:color="auto" w:sz="4"/>
+          <w:left w:val="single" w:color="auto" w:sz="4"/>
+          <w:bottom w:val="single" w:color="auto" w:sz="4"/>
+          <w:right w:val="single" w:color="auto" w:sz="4"/>
+          <w:insideH w:val="single" w:color="auto" w:sz="4"/>
+          <w:insideV w:val="single" w:color="auto" w:sz="4"/>
+        </w:tblBorders>
+      </w:tblPr>
+      <w:tblGrid>
+        <w:gridCol w:w="9866"/>
+      </w:tblGrid>
+      <w:tr>
+        <w:tc>
+          <w:tcPr>
+            <w:tcW w:type="dxa" w:w="9866"/>
+            <w:tcBorders>
+              <w:top w:val="none" w:color="FFFFFF" w:sz="0"/>
+              <w:left w:val="single" w:color="111111" w:sz="24"/>
+              <w:bottom w:val="none" w:color="FFFFFF" w:sz="0"/>
+              <w:right w:val="none" w:color="FFFFFF" w:sz="0"/>
+            </w:tcBorders>
+            <w:shd w:fill="F3F3F3" w:color="auto" w:val="clear"/>
+            <w:tcMar>
+              <w:top w:type="dxa" w:w="60"/>
+              <w:left w:type="dxa" w:w="100"/>
+              <w:bottom w:type="dxa" w:w="60"/>
+              <w:right w:type="dxa" w:w="100"/>
+            </w:tcMar>
+            <w:vAlign w:val="top"/>
+          </w:tcPr>
+          <w:p>
+            <w:pPr>
+              <w:spacing w:after="30" w:before="0" w:line="300"/>
+            </w:pPr>
+            <w:r>
+              <w:rPr>
+                <w:rFonts w:ascii="Malgun Gothic" w:cs="Malgun Gothic" w:eastAsia="Malgun Gothic" w:hAnsi="Malgun Gothic"/>
+                <w:color w:val="111111"/>
+                <w:sz w:val="17"/>
+                <w:szCs w:val="17"/>
+              </w:rPr>
+              <w:t xml:space="preserve">refuse, reject도 뜻은 같지만 조건(두 단어 구동사)에 맞는 것은 turn down.</w:t>
+            </w:r>
+          </w:p>
+        </w:tc>
+      </w:tr>
+    </w:tbl>
+    <w:p>
+      <w:pPr>
+        <w:keepNext/>
+        <w:spacing w:after="60" w:before="240" w:line="300"/>
+      </w:pPr>
+      <w:r>
+        <w:rPr>
+          <w:rFonts w:ascii="Malgun Gothic" w:cs="Malgun Gothic" w:eastAsia="Malgun Gothic" w:hAnsi="Malgun Gothic"/>
+          <w:b/>
+          <w:bCs/>
+          <w:color w:val="FFFFFF"/>
+          <w:sz w:val="17"/>
+          <w:szCs w:val="17"/>
+          <w:shd w:fill="B3261E" w:color="auto" w:val="clear"/>
+        </w:rPr>
+        <w:t xml:space="preserve"> POINT 4 </w:t>
+      </w:r>
+      <w:r>
+        <w:rPr>
+          <w:rFonts w:ascii="Malgun Gothic" w:cs="Malgun Gothic" w:eastAsia="Malgun Gothic" w:hAnsi="Malgun Gothic"/>
+          <w:b/>
+          <w:bCs/>
+          <w:color w:val="111111"/>
+          <w:sz w:val="22"/>
+          <w:szCs w:val="22"/>
+        </w:rPr>
+        <w:t xml:space="preserve">  글의 목적 → 요약문 · 영어 서술</w:t>
+      </w:r>
+      <w:r>
+        <w:rPr>
+          <w:rFonts w:ascii="Malgun Gothic" w:cs="Malgun Gothic" w:eastAsia="Malgun Gothic" w:hAnsi="Malgun Gothic"/>
+          <w:color w:val="6B6B6B"/>
+          <w:sz w:val="16"/>
+          <w:szCs w:val="16"/>
+        </w:rPr>
+        <w:t xml:space="preserve">   [4, 5번 문장]</w:t>
+      </w:r>
+    </w:p>
+    <w:p>
+      <w:pPr>
+        <w:keepNext/>
+        <w:spacing w:after="60" w:before="0" w:line="300"/>
+      </w:pPr>
+      <w:r>
+        <w:rPr>
+          <w:rFonts w:ascii="Malgun Gothic" w:cs="Malgun Gothic" w:eastAsia="Malgun Gothic" w:hAnsi="Malgun Gothic"/>
+          <w:color w:val="6B6B6B"/>
+          <w:sz w:val="17"/>
+          <w:szCs w:val="17"/>
+        </w:rPr>
+        <w:t xml:space="preserve">왜 중요? 목적 유형 지문은 내신에서 요약문 완성이나 '글의 목적을 영어로 쓰기'로 바꿔 낸다.</w:t>
+      </w:r>
+    </w:p>
+    <w:tbl>
+      <w:tblPr>
+        <w:tblW w:type="dxa" w:w="9866"/>
+        <w:tblBorders>
+          <w:top w:val="single" w:color="auto" w:sz="4"/>
+          <w:left w:val="single" w:color="auto" w:sz="4"/>
+          <w:bottom w:val="single" w:color="auto" w:sz="4"/>
+          <w:right w:val="single" w:color="auto" w:sz="4"/>
+          <w:insideH w:val="single" w:color="auto" w:sz="4"/>
+          <w:insideV w:val="single" w:color="auto" w:sz="4"/>
+        </w:tblBorders>
+      </w:tblPr>
+      <w:tblGrid>
+        <w:gridCol w:w="9866"/>
+      </w:tblGrid>
+      <w:tr>
+        <w:tc>
+          <w:tcPr>
+            <w:tcW w:type="dxa" w:w="9866"/>
+            <w:tcBorders>
+              <w:top w:val="none" w:color="FFFFFF" w:sz="0"/>
+              <w:left w:val="single" w:color="111111" w:sz="24"/>
+              <w:bottom w:val="none" w:color="FFFFFF" w:sz="0"/>
+              <w:right w:val="none" w:color="FFFFFF" w:sz="0"/>
+            </w:tcBorders>
+            <w:shd w:fill="F3F3F3" w:color="auto" w:val="clear"/>
+            <w:tcMar>
+              <w:top w:type="dxa" w:w="60"/>
+              <w:left w:type="dxa" w:w="100"/>
+              <w:bottom w:type="dxa" w:w="60"/>
+              <w:right w:type="dxa" w:w="100"/>
+            </w:tcMar>
+            <w:vAlign w:val="top"/>
+          </w:tcPr>
+          <w:p>
+            <w:pPr>
+              <w:spacing w:after="60" w:before="0" w:line="300"/>
+            </w:pPr>
+            <w:r>
+              <w:rPr>
+                <w:rFonts w:ascii="Malgun Gothic" w:cs="Malgun Gothic" w:eastAsia="Malgun Gothic" w:hAnsi="Malgun Gothic"/>
+                <w:b/>
+                <w:bCs/>
+                <w:color w:val="111111"/>
+                <w:sz w:val="19"/>
+                <w:szCs w:val="19"/>
+              </w:rPr>
+              <w:t xml:space="preserve">정리</w:t>
+            </w:r>
+          </w:p>
+          <w:p>
+            <w:pPr>
+              <w:spacing w:after="40" w:before="0" w:line="300"/>
+            </w:pPr>
+            <w:r>
+              <w:rPr>
+                <w:rFonts w:ascii="Malgun Gothic" w:cs="Malgun Gothic" w:eastAsia="Malgun Gothic" w:hAnsi="Malgun Gothic"/>
+                <w:color w:val="111111"/>
+                <w:sz w:val="18"/>
+                <w:szCs w:val="18"/>
+              </w:rPr>
+              <w:t xml:space="preserve">목적 근거: 4번 However ~ not be able to give a speech / 5번 must decline your invitation</w:t>
+            </w:r>
+          </w:p>
+          <w:p>
+            <w:pPr>
+              <w:spacing w:after="40" w:before="0" w:line="300"/>
+            </w:pPr>
+            <w:r>
+              <w:rPr>
+                <w:rFonts w:ascii="Malgun Gothic" w:cs="Malgun Gothic" w:eastAsia="Malgun Gothic" w:hAnsi="Malgun Gothic"/>
+                <w:color w:val="111111"/>
+                <w:sz w:val="18"/>
+                <w:szCs w:val="18"/>
+              </w:rPr>
+              <w:t xml:space="preserve">핵심 표현: feel honored(영광스럽다), decline the invitation(초청을 거절하다), overseas business trip(해외 출장)</w:t>
+            </w:r>
+          </w:p>
+        </w:tc>
+      </w:tr>
+    </w:tbl>
+    <w:p>
+      <w:pPr>
+        <w:spacing w:after="60" w:before="0" w:line="300"/>
+      </w:pPr>
+      <w:r>
+        <w:rPr>
+          <w:rFonts w:ascii="Malgun Gothic" w:cs="Malgun Gothic" w:eastAsia="Malgun Gothic" w:hAnsi="Malgun Gothic"/>
+          <w:color w:val="111111"/>
+          <w:sz w:val="20"/>
+          <w:szCs w:val="20"/>
+        </w:rPr>
+        <w:t xml:space="preserve"/>
+      </w:r>
+    </w:p>
+    <w:p>
+      <w:pPr>
+        <w:keepNext/>
+        <w:spacing w:after="0" w:before="60" w:line="300"/>
+      </w:pPr>
+      <w:r>
+        <w:rPr>
+          <w:rFonts w:ascii="Malgun Gothic" w:cs="Malgun Gothic" w:eastAsia="Malgun Gothic" w:hAnsi="Malgun Gothic"/>
+          <w:b/>
+          <w:bCs/>
+          <w:color w:val="111111"/>
+          <w:sz w:val="19"/>
+          <w:szCs w:val="19"/>
+        </w:rPr>
+        <w:t xml:space="preserve">▶ 이렇게 내면 된다</w:t>
+      </w:r>
+    </w:p>
+    <w:p>
+      <w:pPr>
+        <w:keepNext/>
+        <w:spacing w:after="80" w:before="200" w:line="300"/>
+      </w:pPr>
+      <w:r>
+        <w:rPr>
+          <w:rFonts w:ascii="Malgun Gothic" w:cs="Malgun Gothic" w:eastAsia="Malgun Gothic" w:hAnsi="Malgun Gothic"/>
+          <w:b/>
+          <w:bCs/>
+          <w:color w:val="111111"/>
+          <w:sz w:val="21"/>
+          <w:szCs w:val="21"/>
+        </w:rPr>
+        <w:t xml:space="preserve">1. </w:t>
+      </w:r>
+      <w:r>
+        <w:rPr>
+          <w:rFonts w:ascii="Malgun Gothic" w:cs="Malgun Gothic" w:eastAsia="Malgun Gothic" w:hAnsi="Malgun Gothic"/>
+          <w:b/>
+          <w:bCs/>
+          <w:color w:val="111111"/>
+          <w:sz w:val="20"/>
+          <w:szCs w:val="20"/>
+        </w:rPr>
+        <w:t xml:space="preserve">다음 글의 내용을 요약할 때, 빈칸 (A), (B)에 들어갈 말로 가장 적절한 것은?</w:t>
+      </w:r>
+      <w:r>
+        <w:rPr>
+          <w:rFonts w:ascii="Malgun Gothic" w:cs="Malgun Gothic" w:eastAsia="Malgun Gothic" w:hAnsi="Malgun Gothic"/>
+          <w:color w:val="6B6B6B"/>
+          <w:sz w:val="15"/>
+          <w:szCs w:val="15"/>
+        </w:rPr>
+        <w:t xml:space="preserve">  [요약문 완성]</w:t>
+      </w:r>
+    </w:p>
+    <w:tbl>
+      <w:tblPr>
+        <w:tblW w:type="dxa" w:w="9866"/>
+        <w:tblBorders>
+          <w:top w:val="single" w:color="auto" w:sz="4"/>
+          <w:left w:val="single" w:color="auto" w:sz="4"/>
+          <w:bottom w:val="single" w:color="auto" w:sz="4"/>
+          <w:right w:val="single" w:color="auto" w:sz="4"/>
+          <w:insideH w:val="single" w:color="auto" w:sz="4"/>
+          <w:insideV w:val="single" w:color="auto" w:sz="4"/>
+        </w:tblBorders>
+      </w:tblPr>
+      <w:tblGrid>
+        <w:gridCol w:w="9866"/>
+      </w:tblGrid>
+      <w:tr>
+        <w:tc>
+          <w:tcPr>
+            <w:tcW w:type="dxa" w:w="9866"/>
+            <w:tcBorders>
+              <w:top w:val="none" w:color="FFFFFF" w:sz="0"/>
+              <w:left w:val="single" w:color="B5B5B5" w:sz="24"/>
+              <w:bottom w:val="none" w:color="FFFFFF" w:sz="0"/>
+              <w:right w:val="none" w:color="FFFFFF" w:sz="0"/>
+            </w:tcBorders>
+            <w:shd w:fill="FFFFFF" w:color="auto" w:val="clear"/>
+            <w:tcMar>
+              <w:top w:type="dxa" w:w="60"/>
+              <w:left w:type="dxa" w:w="100"/>
+              <w:bottom w:type="dxa" w:w="60"/>
+              <w:right w:type="dxa" w:w="100"/>
+            </w:tcMar>
+            <w:vAlign w:val="top"/>
+          </w:tcPr>
+          <w:p>
+            <w:pPr>
+              <w:spacing w:after="40" w:before="0" w:line="340"/>
+            </w:pPr>
+            <w:r>
+              <w:rPr>
+                <w:rFonts w:ascii="Malgun Gothic" w:cs="Malgun Gothic" w:eastAsia="Malgun Gothic" w:hAnsi="Malgun Gothic"/>
+                <w:color w:val="111111"/>
+                <w:sz w:val="19"/>
+                <w:szCs w:val="19"/>
+              </w:rPr>
+              <w:t xml:space="preserve">Jane, a former student, feels (A) ________ to be invited to speak at the graduation ceremony, but she has to (B) ________ the invitation because of a business trip abroad.</w:t>
+            </w:r>
+          </w:p>
+        </w:tc>
+      </w:tr>
+    </w:tbl>
+    <w:p>
+      <w:pPr>
+        <w:spacing w:after="60" w:before="0" w:line="300"/>
+      </w:pPr>
+      <w:r>
+        <w:rPr>
+          <w:rFonts w:ascii="Malgun Gothic" w:cs="Malgun Gothic" w:eastAsia="Malgun Gothic" w:hAnsi="Malgun Gothic"/>
+          <w:color w:val="111111"/>
+          <w:sz w:val="20"/>
+          <w:szCs w:val="20"/>
+        </w:rPr>
+        <w:t xml:space="preserve"/>
+      </w:r>
+    </w:p>
+    <w:p>
+      <w:pPr>
+        <w:spacing w:after="30" w:before="0" w:line="300"/>
+        <w:ind w:left="200"/>
+      </w:pPr>
+      <w:r>
+        <w:rPr>
+          <w:rFonts w:ascii="Malgun Gothic" w:cs="Malgun Gothic" w:eastAsia="Malgun Gothic" w:hAnsi="Malgun Gothic"/>
+          <w:color w:val="111111"/>
+          <w:sz w:val="19"/>
+          <w:szCs w:val="19"/>
+        </w:rPr>
+        <w:t xml:space="preserve">① honored — accept</w:t>
+      </w:r>
+    </w:p>
+    <w:p>
+      <w:pPr>
+        <w:spacing w:after="30" w:before="0" w:line="300"/>
+        <w:ind w:left="200"/>
+      </w:pPr>
+      <w:r>
+        <w:rPr>
+          <w:rFonts w:ascii="Malgun Gothic" w:cs="Malgun Gothic" w:eastAsia="Malgun Gothic" w:hAnsi="Malgun Gothic"/>
+          <w:color w:val="111111"/>
+          <w:sz w:val="19"/>
+          <w:szCs w:val="19"/>
+        </w:rPr>
+        <w:t xml:space="preserve">② honored — decline</w:t>
+      </w:r>
+    </w:p>
+    <w:p>
+      <w:pPr>
+        <w:spacing w:after="30" w:before="0" w:line="300"/>
+        <w:ind w:left="200"/>
+      </w:pPr>
+      <w:r>
+        <w:rPr>
+          <w:rFonts w:ascii="Malgun Gothic" w:cs="Malgun Gothic" w:eastAsia="Malgun Gothic" w:hAnsi="Malgun Gothic"/>
+          <w:color w:val="111111"/>
+          <w:sz w:val="19"/>
+          <w:szCs w:val="19"/>
+        </w:rPr>
+        <w:t xml:space="preserve">③ disappointed — decline</w:t>
+      </w:r>
+    </w:p>
+    <w:p>
+      <w:pPr>
+        <w:spacing w:after="30" w:before="0" w:line="300"/>
+        <w:ind w:left="200"/>
+      </w:pPr>
+      <w:r>
+        <w:rPr>
+          <w:rFonts w:ascii="Malgun Gothic" w:cs="Malgun Gothic" w:eastAsia="Malgun Gothic" w:hAnsi="Malgun Gothic"/>
+          <w:color w:val="111111"/>
+          <w:sz w:val="19"/>
+          <w:szCs w:val="19"/>
+        </w:rPr>
+        <w:t xml:space="preserve">④ disappointed — accept</w:t>
+      </w:r>
+    </w:p>
+    <w:p>
+      <w:pPr>
+        <w:spacing w:after="30" w:before="0" w:line="300"/>
+        <w:ind w:left="200"/>
+      </w:pPr>
+      <w:r>
+        <w:rPr>
+          <w:rFonts w:ascii="Malgun Gothic" w:cs="Malgun Gothic" w:eastAsia="Malgun Gothic" w:hAnsi="Malgun Gothic"/>
+          <w:color w:val="111111"/>
+          <w:sz w:val="19"/>
+          <w:szCs w:val="19"/>
+        </w:rPr>
+        <w:t xml:space="preserve">⑤ worried — postpone</w:t>
+      </w:r>
+    </w:p>
+    <w:p>
+      <w:pPr>
+        <w:spacing w:after="40" w:before="60" w:line="300"/>
+      </w:pPr>
+      <w:r>
+        <w:rPr>
+          <w:rFonts w:ascii="Malgun Gothic" w:cs="Malgun Gothic" w:eastAsia="Malgun Gothic" w:hAnsi="Malgun Gothic"/>
+          <w:color w:val="111111"/>
+          <w:sz w:val="19"/>
+          <w:szCs w:val="19"/>
+        </w:rPr>
+        <w:t xml:space="preserve">정답  </w:t>
+      </w:r>
+      <w:r>
+        <w:rPr>
+          <w:rFonts w:ascii="Malgun Gothic" w:cs="Malgun Gothic" w:eastAsia="Malgun Gothic" w:hAnsi="Malgun Gothic"/>
+          <w:b/>
+          <w:bCs/>
+          <w:color w:val="B3261E"/>
+          <w:sz w:val="19"/>
+          <w:szCs w:val="19"/>
+        </w:rPr>
+        <w:t xml:space="preserve">② honored — decline</w:t>
+      </w:r>
+    </w:p>
+    <w:tbl>
+      <w:tblPr>
+        <w:tblW w:type="dxa" w:w="9866"/>
+        <w:tblBorders>
+          <w:top w:val="single" w:color="auto" w:sz="4"/>
+          <w:left w:val="single" w:color="auto" w:sz="4"/>
+          <w:bottom w:val="single" w:color="auto" w:sz="4"/>
+          <w:right w:val="single" w:color="auto" w:sz="4"/>
+          <w:insideH w:val="single" w:color="auto" w:sz="4"/>
+          <w:insideV w:val="single" w:color="auto" w:sz="4"/>
+        </w:tblBorders>
+      </w:tblPr>
+      <w:tblGrid>
+        <w:gridCol w:w="9866"/>
+      </w:tblGrid>
+      <w:tr>
+        <w:tc>
+          <w:tcPr>
+            <w:tcW w:type="dxa" w:w="9866"/>
+            <w:tcBorders>
+              <w:top w:val="none" w:color="FFFFFF" w:sz="0"/>
+              <w:left w:val="single" w:color="111111" w:sz="24"/>
+              <w:bottom w:val="none" w:color="FFFFFF" w:sz="0"/>
+              <w:right w:val="none" w:color="FFFFFF" w:sz="0"/>
+            </w:tcBorders>
+            <w:shd w:fill="F3F3F3" w:color="auto" w:val="clear"/>
+            <w:tcMar>
+              <w:top w:type="dxa" w:w="60"/>
+              <w:left w:type="dxa" w:w="100"/>
+              <w:bottom w:type="dxa" w:w="60"/>
+              <w:right w:type="dxa" w:w="100"/>
+            </w:tcMar>
+            <w:vAlign w:val="top"/>
+          </w:tcPr>
+          <w:p>
+            <w:pPr>
+              <w:spacing w:after="30" w:before="0" w:line="300"/>
+            </w:pPr>
+            <w:r>
+              <w:rPr>
+                <w:rFonts w:ascii="Malgun Gothic" w:cs="Malgun Gothic" w:eastAsia="Malgun Gothic" w:hAnsi="Malgun Gothic"/>
+                <w:color w:val="111111"/>
+                <w:sz w:val="17"/>
+                <w:szCs w:val="17"/>
+              </w:rPr>
+              <w:t xml:space="preserve">3번 문장 felt honored, 5번 문장 must decline your invitation.</w:t>
+            </w:r>
+          </w:p>
+        </w:tc>
+      </w:tr>
+    </w:tbl>
+    <w:p>
+      <w:pPr>
+        <w:keepNext/>
+        <w:spacing w:after="80" w:before="200" w:line="300"/>
+      </w:pPr>
+      <w:r>
+        <w:rPr>
+          <w:rFonts w:ascii="Malgun Gothic" w:cs="Malgun Gothic" w:eastAsia="Malgun Gothic" w:hAnsi="Malgun Gothic"/>
+          <w:b/>
+          <w:bCs/>
+          <w:color w:val="111111"/>
+          <w:sz w:val="21"/>
+          <w:szCs w:val="21"/>
+        </w:rPr>
+        <w:t xml:space="preserve">2. </w:t>
+      </w:r>
+      <w:r>
+        <w:rPr>
+          <w:rFonts w:ascii="Malgun Gothic" w:cs="Malgun Gothic" w:eastAsia="Malgun Gothic" w:hAnsi="Malgun Gothic"/>
+          <w:b/>
+          <w:bCs/>
+          <w:color w:val="111111"/>
+          <w:sz w:val="20"/>
+          <w:szCs w:val="20"/>
+        </w:rPr>
+        <w:t xml:space="preserve">이 글의 목적을 영어 한 문장으로 쓰시오. (invitation, because of를 반드시 사용할 것)</w:t>
+      </w:r>
+      <w:r>
+        <w:rPr>
+          <w:rFonts w:ascii="Malgun Gothic" w:cs="Malgun Gothic" w:eastAsia="Malgun Gothic" w:hAnsi="Malgun Gothic"/>
+          <w:color w:val="6B6B6B"/>
+          <w:sz w:val="15"/>
+          <w:szCs w:val="15"/>
+        </w:rPr>
+        <w:t xml:space="preserve">  [조건 영작(서술형)]</w:t>
+      </w:r>
+    </w:p>
+    <w:p>
+      <w:pPr>
+        <w:spacing w:after="40" w:before="60" w:line="300"/>
+      </w:pPr>
+      <w:r>
+        <w:rPr>
+          <w:rFonts w:ascii="Malgun Gothic" w:cs="Malgun Gothic" w:eastAsia="Malgun Gothic" w:hAnsi="Malgun Gothic"/>
+          <w:color w:val="111111"/>
+          <w:sz w:val="19"/>
+          <w:szCs w:val="19"/>
+        </w:rPr>
+        <w:t xml:space="preserve">정답  </w:t>
+      </w:r>
+      <w:r>
+        <w:rPr>
+          <w:rFonts w:ascii="Malgun Gothic" w:cs="Malgun Gothic" w:eastAsia="Malgun Gothic" w:hAnsi="Malgun Gothic"/>
+          <w:b/>
+          <w:bCs/>
+          <w:color w:val="B3261E"/>
+          <w:sz w:val="19"/>
+          <w:szCs w:val="19"/>
+        </w:rPr>
+        <w:t xml:space="preserve">The writer declines the invitation to give a graduation speech because of an overseas business trip.</w:t>
+      </w:r>
+    </w:p>
+    <w:tbl>
+      <w:tblPr>
+        <w:tblW w:type="dxa" w:w="9866"/>
+        <w:tblBorders>
+          <w:top w:val="single" w:color="auto" w:sz="4"/>
+          <w:left w:val="single" w:color="auto" w:sz="4"/>
+          <w:bottom w:val="single" w:color="auto" w:sz="4"/>
+          <w:right w:val="single" w:color="auto" w:sz="4"/>
+          <w:insideH w:val="single" w:color="auto" w:sz="4"/>
+          <w:insideV w:val="single" w:color="auto" w:sz="4"/>
+        </w:tblBorders>
+      </w:tblPr>
+      <w:tblGrid>
+        <w:gridCol w:w="9866"/>
+      </w:tblGrid>
+      <w:tr>
+        <w:tc>
+          <w:tcPr>
+            <w:tcW w:type="dxa" w:w="9866"/>
+            <w:tcBorders>
+              <w:top w:val="none" w:color="FFFFFF" w:sz="0"/>
+              <w:left w:val="single" w:color="111111" w:sz="24"/>
+              <w:bottom w:val="none" w:color="FFFFFF" w:sz="0"/>
+              <w:right w:val="none" w:color="FFFFFF" w:sz="0"/>
+            </w:tcBorders>
+            <w:shd w:fill="F3F3F3" w:color="auto" w:val="clear"/>
+            <w:tcMar>
+              <w:top w:type="dxa" w:w="60"/>
+              <w:left w:type="dxa" w:w="100"/>
+              <w:bottom w:type="dxa" w:w="60"/>
+              <w:right w:type="dxa" w:w="100"/>
+            </w:tcMar>
+            <w:vAlign w:val="top"/>
+          </w:tcPr>
+          <w:p>
+            <w:pPr>
+              <w:spacing w:after="30" w:before="0" w:line="300"/>
+            </w:pPr>
+            <w:r>
+              <w:rPr>
+                <w:rFonts w:ascii="Malgun Gothic" w:cs="Malgun Gothic" w:eastAsia="Malgun Gothic" w:hAnsi="Malgun Gothic"/>
+                <w:color w:val="111111"/>
+                <w:sz w:val="17"/>
+                <w:szCs w:val="17"/>
+              </w:rPr>
+              <w:t xml:space="preserve">decline 대신 turn down / refuse도 인정. because of 뒤에는 명사(구).</w:t>
+            </w:r>
+          </w:p>
+        </w:tc>
+      </w:tr>
+    </w:tbl>
     <w:p>
       <w:pPr>
         <w:keepNext/>

</xml_diff>